<commit_message>
Add tooltips, feature tour, auto reading mode, accessibility fonts, diagrammer fixes, onboarding, and pitch doc
- Feature tour: 6-step spotlight walkthrough on first run (stored in localStorage)
- Contextual tooltips: ⓘ badge on every settings h3 with detailed explanations
- Reading Display Mode: Auto ✦ button watches WPM live and switches Scan/Default/Deep
- Accessible Reading Fonts: 3-state toggle (Off / OpenDyslexic / Atkinson Hyperlegible)
- Onboarding modal: 14-day training ramp with calibration session and progress bar
- Reed-Kellogg diagrammer: fixed POS tagger, canvas overflow, proportional layout
- Common -ing noun fix: morning/evening/building etc. no longer tagged VERB
- README: updated with all new features, science refs, updated tech details
- PITCH.md: full investor/partner pitch with market sizing, competitive analysis, business models

Co-Authored-By: Claude Sonnet 4.6 <noreply@anthropic.com>
</commit_message>
<xml_diff>
--- a/Focal-Investor-Brief.docx
+++ b/Focal-Investor-Brief.docx
@@ -4,15 +4,63 @@
   <w:body>
     <w:p/>
     <w:p/>
+    <w:p>
+      <w:pPr>
+        <w:jc w:val="center"/>
+      </w:pPr>
+      <w:r>
+        <w:rPr>
+          <w:noProof/>
+        </w:rPr>
+        <w:drawing>
+          <wp:inline distT="0" distB="0" distL="0" distR="0" wp14:anchorId="2409E2C5" wp14:editId="4C42E2D3">
+            <wp:extent cx="2870421" cy="2870421"/>
+            <wp:effectExtent l="0" t="0" r="6350" b="6350"/>
+            <wp:docPr id="126864610" name="Graphic 2"/>
+            <wp:cNvGraphicFramePr>
+              <a:graphicFrameLocks xmlns:a="http://schemas.openxmlformats.org/drawingml/2006/main" noChangeAspect="1"/>
+            </wp:cNvGraphicFramePr>
+            <a:graphic xmlns:a="http://schemas.openxmlformats.org/drawingml/2006/main">
+              <a:graphicData uri="http://schemas.openxmlformats.org/drawingml/2006/picture">
+                <pic:pic xmlns:pic="http://schemas.openxmlformats.org/drawingml/2006/picture">
+                  <pic:nvPicPr>
+                    <pic:cNvPr id="126864610" name="Graphic 2"/>
+                    <pic:cNvPicPr/>
+                  </pic:nvPicPr>
+                  <pic:blipFill>
+                    <a:blip r:embed="rId7">
+                      <a:extLst>
+                        <a:ext uri="{96DAC541-7B7A-43D3-8B79-37D633B846F1}">
+                          <asvg:svgBlip xmlns:asvg="http://schemas.microsoft.com/office/drawing/2016/SVG/main" r:embed="rId8"/>
+                        </a:ext>
+                      </a:extLst>
+                    </a:blip>
+                    <a:stretch>
+                      <a:fillRect/>
+                    </a:stretch>
+                  </pic:blipFill>
+                  <pic:spPr>
+                    <a:xfrm>
+                      <a:off x="0" y="0"/>
+                      <a:ext cx="2878059" cy="2878059"/>
+                    </a:xfrm>
+                    <a:prstGeom prst="rect">
+                      <a:avLst/>
+                    </a:prstGeom>
+                  </pic:spPr>
+                </pic:pic>
+              </a:graphicData>
+            </a:graphic>
+          </wp:inline>
+        </w:drawing>
+      </w:r>
+    </w:p>
     <w:p/>
     <w:p/>
-    <w:p/>
     <w:p>
       <w:pPr>
         <w:spacing w:before="60" w:after="160"/>
         <w:jc w:val="center"/>
-      </w:pPr>
-      <w:r>
         <w:rPr>
           <w:b/>
           <w:bCs/>
@@ -20,7 +68,42 @@
           <w:sz w:val="96"/>
           <w:szCs w:val="96"/>
         </w:rPr>
-        <w:t>FOCAL</w:t>
+      </w:pPr>
+      <w:r>
+        <w:rPr>
+          <w:b/>
+          <w:bCs/>
+          <w:color w:val="1E3A5F"/>
+          <w:sz w:val="96"/>
+          <w:szCs w:val="96"/>
+        </w:rPr>
+        <w:t>Focal</w:t>
+      </w:r>
+    </w:p>
+    <w:p>
+      <w:pPr>
+        <w:spacing w:before="60" w:after="160"/>
+        <w:jc w:val="center"/>
+      </w:pPr>
+      <w:r>
+        <w:rPr>
+          <w:b/>
+          <w:bCs/>
+          <w:color w:val="1E3A5F"/>
+          <w:sz w:val="96"/>
+          <w:szCs w:val="96"/>
+        </w:rPr>
+        <w:t>Speed Reading</w:t>
+      </w:r>
+      <w:r>
+        <w:rPr>
+          <w:b/>
+          <w:bCs/>
+          <w:color w:val="1E3A5F"/>
+          <w:sz w:val="96"/>
+          <w:szCs w:val="96"/>
+        </w:rPr>
+        <w:br/>
       </w:r>
     </w:p>
     <w:p>
@@ -51,25 +134,7 @@
           <w:sz w:val="24"/>
           <w:szCs w:val="24"/>
         </w:rPr>
-        <w:t xml:space="preserve">Investor </w:t>
-      </w:r>
-      <w:proofErr w:type="gramStart"/>
-      <w:r>
-        <w:rPr>
-          <w:color w:val="4A5568"/>
-          <w:sz w:val="24"/>
-          <w:szCs w:val="24"/>
-        </w:rPr>
-        <w:t>Brief  •</w:t>
-      </w:r>
-      <w:proofErr w:type="gramEnd"/>
-      <w:r>
-        <w:rPr>
-          <w:color w:val="4A5568"/>
-          <w:sz w:val="24"/>
-          <w:szCs w:val="24"/>
-        </w:rPr>
-        <w:t xml:space="preserve">  202</w:t>
+        <w:t>Investor Brief  •  202</w:t>
       </w:r>
       <w:r>
         <w:rPr>
@@ -122,22 +187,11 @@
     <w:p/>
     <w:p/>
     <w:p/>
-    <w:p/>
-    <w:p/>
-    <w:p>
-      <w:pPr>
-        <w:spacing w:before="80" w:after="160"/>
-      </w:pPr>
-      <w:r>
-        <w:br w:type="page"/>
-      </w:r>
-    </w:p>
     <w:p>
       <w:pPr>
         <w:pStyle w:val="Heading1"/>
       </w:pPr>
       <w:r>
-        <w:lastRenderedPageBreak/>
         <w:t>Executive Summary</w:t>
       </w:r>
     </w:p>
@@ -172,12 +226,6 @@
         <w:gridCol w:w="7920"/>
       </w:tblGrid>
       <w:tr>
-        <w:tblPrEx>
-          <w:tblCellMar>
-            <w:top w:w="0" w:type="dxa"/>
-            <w:bottom w:w="0" w:type="dxa"/>
-          </w:tblCellMar>
-        </w:tblPrEx>
         <w:tc>
           <w:tcPr>
             <w:tcW w:w="1440" w:type="dxa"/>
@@ -249,21 +297,7 @@
         <w:rPr>
           <w:color w:val="0D1B2A"/>
         </w:rPr>
-        <w:t xml:space="preserve">One in five people has a reading disability. For hundreds of millions of people worldwide, the act of reading — the foundational skill on which education, employment, and civic life depend — is genuinely, neurologically difficult. Not because of lack of intelligence or effort. Because the format in which we deliver text was designed for people whose brains process it </w:t>
-      </w:r>
-      <w:proofErr w:type="gramStart"/>
-      <w:r>
-        <w:rPr>
-          <w:color w:val="0D1B2A"/>
-        </w:rPr>
-        <w:t>easily, and</w:t>
-      </w:r>
-      <w:proofErr w:type="gramEnd"/>
-      <w:r>
-        <w:rPr>
-          <w:color w:val="0D1B2A"/>
-        </w:rPr>
-        <w:t xml:space="preserve"> never reconsidered for those who do not.</w:t>
+        <w:t>One in five people has a reading disability. For hundreds of millions of people worldwide, the act of reading — the foundational skill on which education, employment, and civic life depend — is genuinely, neurologically difficult. Not because of lack of intelligence or effort. Because the format in which we deliver text was designed for people whose brains process it easily, and never reconsidered for those who do not.</w:t>
       </w:r>
     </w:p>
     <w:p>
@@ -285,21 +319,7 @@
         <w:rPr>
           <w:color w:val="0D1B2A"/>
         </w:rPr>
-        <w:t xml:space="preserve">Research by Forster (1970) and Potter (1984) demonstrated that RSVP allows processing rates of 700+ WPM for trained readers. With </w:t>
-      </w:r>
-      <w:proofErr w:type="spellStart"/>
-      <w:r>
-        <w:rPr>
-          <w:color w:val="0D1B2A"/>
-        </w:rPr>
-        <w:t>Focal’s</w:t>
-      </w:r>
-      <w:proofErr w:type="spellEnd"/>
-      <w:r>
-        <w:rPr>
-          <w:color w:val="0D1B2A"/>
-        </w:rPr>
-        <w:t xml:space="preserve"> Optimal Recognition Point alignment, intelligent adaptive pacing, and full accessibility toolkit, that potential is now available to everyone — especially those who need it most.</w:t>
+        <w:t>Research by Forster (1970) and Potter (1984) demonstrated that RSVP allows processing rates of 700+ WPM for trained readers. With Focal’s Optimal Recognition Point alignment, intelligent adaptive pacing, and full accessibility toolkit, that potential is now available to everyone — especially those who need it most.</w:t>
       </w:r>
     </w:p>
     <w:p/>
@@ -327,12 +347,6 @@
         <w:gridCol w:w="2340"/>
       </w:tblGrid>
       <w:tr>
-        <w:tblPrEx>
-          <w:tblCellMar>
-            <w:top w:w="0" w:type="dxa"/>
-            <w:bottom w:w="0" w:type="dxa"/>
-          </w:tblCellMar>
-        </w:tblPrEx>
         <w:tc>
           <w:tcPr>
             <w:tcW w:w="2340" w:type="dxa"/>
@@ -471,12 +485,6 @@
         </w:tc>
       </w:tr>
       <w:tr>
-        <w:tblPrEx>
-          <w:tblCellMar>
-            <w:top w:w="0" w:type="dxa"/>
-            <w:bottom w:w="0" w:type="dxa"/>
-          </w:tblCellMar>
-        </w:tblPrEx>
         <w:tc>
           <w:tcPr>
             <w:tcW w:w="2340" w:type="dxa"/>
@@ -504,25 +512,7 @@
                 <w:sz w:val="17"/>
                 <w:szCs w:val="17"/>
               </w:rPr>
-              <w:t xml:space="preserve">people </w:t>
-            </w:r>
-            <w:proofErr w:type="gramStart"/>
-            <w:r>
-              <w:rPr>
-                <w:color w:val="4A5568"/>
-                <w:sz w:val="17"/>
-                <w:szCs w:val="17"/>
-              </w:rPr>
-              <w:t>has</w:t>
-            </w:r>
-            <w:proofErr w:type="gramEnd"/>
-            <w:r>
-              <w:rPr>
-                <w:color w:val="4A5568"/>
-                <w:sz w:val="17"/>
-                <w:szCs w:val="17"/>
-              </w:rPr>
-              <w:t xml:space="preserve"> a reading disability</w:t>
+              <w:t>people has a reading disability</w:t>
             </w:r>
           </w:p>
         </w:tc>
@@ -801,12 +791,6 @@
         <w:gridCol w:w="7920"/>
       </w:tblGrid>
       <w:tr>
-        <w:tblPrEx>
-          <w:tblCellMar>
-            <w:top w:w="0" w:type="dxa"/>
-            <w:bottom w:w="0" w:type="dxa"/>
-          </w:tblCellMar>
-        </w:tblPrEx>
         <w:tc>
           <w:tcPr>
             <w:tcW w:w="1440" w:type="dxa"/>
@@ -940,12 +924,6 @@
         <w:gridCol w:w="2340"/>
       </w:tblGrid>
       <w:tr>
-        <w:tblPrEx>
-          <w:tblCellMar>
-            <w:top w:w="0" w:type="dxa"/>
-            <w:bottom w:w="0" w:type="dxa"/>
-          </w:tblCellMar>
-        </w:tblPrEx>
         <w:tc>
           <w:tcPr>
             <w:tcW w:w="2340" w:type="dxa"/>
@@ -1084,12 +1062,6 @@
         </w:tc>
       </w:tr>
       <w:tr>
-        <w:tblPrEx>
-          <w:tblCellMar>
-            <w:top w:w="0" w:type="dxa"/>
-            <w:bottom w:w="0" w:type="dxa"/>
-          </w:tblCellMar>
-        </w:tblPrEx>
         <w:tc>
           <w:tcPr>
             <w:tcW w:w="2340" w:type="dxa"/>
@@ -1245,21 +1217,7 @@
         <w:rPr>
           <w:color w:val="0D1B2A"/>
         </w:rPr>
-        <w:t xml:space="preserve">Research by </w:t>
-      </w:r>
-      <w:proofErr w:type="spellStart"/>
-      <w:r>
-        <w:rPr>
-          <w:color w:val="0D1B2A"/>
-        </w:rPr>
-        <w:t>Brysbaert</w:t>
-      </w:r>
-      <w:proofErr w:type="spellEnd"/>
-      <w:r>
-        <w:rPr>
-          <w:color w:val="0D1B2A"/>
-        </w:rPr>
-        <w:t xml:space="preserve"> &amp; Nazir (1998) identified the Optimal Recognition Point: the specific character position within each word where the brain’s lexical recognition fires most rapidly. This is not the center of the word — it is slightly left of center, varying by word length:</w:t>
+        <w:t>Research by Brysbaert &amp; Nazir (1998) identified the Optimal Recognition Point: the specific character position within each word where the brain’s lexical recognition fires most rapidly. This is not the center of the word — it is slightly left of center, varying by word length:</w:t>
       </w:r>
     </w:p>
     <w:p>
@@ -1399,19 +1357,11 @@
       <w:pPr>
         <w:spacing w:before="60" w:after="160"/>
       </w:pPr>
-      <w:proofErr w:type="spellStart"/>
-      <w:r>
-        <w:rPr>
-          <w:color w:val="0D1B2A"/>
-        </w:rPr>
-        <w:t>Focal’s</w:t>
-      </w:r>
-      <w:proofErr w:type="spellEnd"/>
-      <w:r>
-        <w:rPr>
-          <w:color w:val="0D1B2A"/>
-        </w:rPr>
-        <w:t xml:space="preserve"> recognition point logic is script-aware, extending the accessibility reach to a global user base:</w:t>
+      <w:r>
+        <w:rPr>
+          <w:color w:val="0D1B2A"/>
+        </w:rPr>
+        <w:t>Focal’s recognition point logic is script-aware, extending the accessibility reach to a global user base:</w:t>
       </w:r>
     </w:p>
     <w:tbl>
@@ -1436,12 +1386,6 @@
         <w:gridCol w:w="5160"/>
       </w:tblGrid>
       <w:tr>
-        <w:tblPrEx>
-          <w:tblCellMar>
-            <w:top w:w="0" w:type="dxa"/>
-            <w:bottom w:w="0" w:type="dxa"/>
-          </w:tblCellMar>
-        </w:tblPrEx>
         <w:tc>
           <w:tcPr>
             <w:tcW w:w="4200" w:type="dxa"/>
@@ -1504,12 +1448,6 @@
         </w:tc>
       </w:tr>
       <w:tr>
-        <w:tblPrEx>
-          <w:tblCellMar>
-            <w:top w:w="0" w:type="dxa"/>
-            <w:bottom w:w="0" w:type="dxa"/>
-          </w:tblCellMar>
-        </w:tblPrEx>
         <w:tc>
           <w:tcPr>
             <w:tcW w:w="4200" w:type="dxa"/>
@@ -1564,36 +1502,72 @@
                 <w:sz w:val="19"/>
                 <w:szCs w:val="19"/>
               </w:rPr>
-              <w:t xml:space="preserve">Standard </w:t>
-            </w:r>
-            <w:proofErr w:type="spellStart"/>
-            <w:r>
-              <w:rPr>
+              <w:t>Standard Brysbaert-Nazir position</w:t>
+            </w:r>
+          </w:p>
+        </w:tc>
+      </w:tr>
+      <w:tr>
+        <w:tc>
+          <w:tcPr>
+            <w:tcW w:w="4200" w:type="dxa"/>
+            <w:tcBorders>
+              <w:top w:val="single" w:sz="1" w:space="0" w:color="CCCCCC"/>
+              <w:left w:val="single" w:sz="1" w:space="0" w:color="CCCCCC"/>
+              <w:bottom w:val="single" w:sz="1" w:space="0" w:color="CCCCCC"/>
+              <w:right w:val="single" w:sz="1" w:space="0" w:color="CCCCCC"/>
+            </w:tcBorders>
+            <w:shd w:val="clear" w:color="auto" w:fill="FFFFFF"/>
+            <w:tcMar>
+              <w:top w:w="80" w:type="dxa"/>
+              <w:left w:w="120" w:type="dxa"/>
+              <w:bottom w:w="80" w:type="dxa"/>
+              <w:right w:w="120" w:type="dxa"/>
+            </w:tcMar>
+          </w:tcPr>
+          <w:p>
+            <w:r>
+              <w:rPr>
+                <w:b/>
+                <w:bCs/>
                 <w:color w:val="0D1B2A"/>
                 <w:sz w:val="19"/>
                 <w:szCs w:val="19"/>
               </w:rPr>
-              <w:t>Brysbaert</w:t>
-            </w:r>
-            <w:proofErr w:type="spellEnd"/>
+              <w:t>Cyrillic (Russian, Ukrainian, Bulgarian...)</w:t>
+            </w:r>
+          </w:p>
+        </w:tc>
+        <w:tc>
+          <w:tcPr>
+            <w:tcW w:w="5160" w:type="dxa"/>
+            <w:tcBorders>
+              <w:top w:val="single" w:sz="1" w:space="0" w:color="CCCCCC"/>
+              <w:left w:val="single" w:sz="1" w:space="0" w:color="CCCCCC"/>
+              <w:bottom w:val="single" w:sz="1" w:space="0" w:color="CCCCCC"/>
+              <w:right w:val="single" w:sz="1" w:space="0" w:color="CCCCCC"/>
+            </w:tcBorders>
+            <w:shd w:val="clear" w:color="auto" w:fill="FFFFFF"/>
+            <w:tcMar>
+              <w:top w:w="80" w:type="dxa"/>
+              <w:left w:w="120" w:type="dxa"/>
+              <w:bottom w:w="80" w:type="dxa"/>
+              <w:right w:w="120" w:type="dxa"/>
+            </w:tcMar>
+          </w:tcPr>
+          <w:p>
             <w:r>
               <w:rPr>
                 <w:color w:val="0D1B2A"/>
                 <w:sz w:val="19"/>
                 <w:szCs w:val="19"/>
               </w:rPr>
-              <w:t>-Nazir position</w:t>
+              <w:t>Adapted for Cyrillic character frequency distribution</w:t>
             </w:r>
           </w:p>
         </w:tc>
       </w:tr>
       <w:tr>
-        <w:tblPrEx>
-          <w:tblCellMar>
-            <w:top w:w="0" w:type="dxa"/>
-            <w:bottom w:w="0" w:type="dxa"/>
-          </w:tblCellMar>
-        </w:tblPrEx>
         <w:tc>
           <w:tcPr>
             <w:tcW w:w="4200" w:type="dxa"/>
@@ -1603,7 +1577,7 @@
               <w:bottom w:val="single" w:sz="1" w:space="0" w:color="CCCCCC"/>
               <w:right w:val="single" w:sz="1" w:space="0" w:color="CCCCCC"/>
             </w:tcBorders>
-            <w:shd w:val="clear" w:color="auto" w:fill="FFFFFF"/>
+            <w:shd w:val="clear" w:color="auto" w:fill="EEF4FA"/>
             <w:tcMar>
               <w:top w:w="80" w:type="dxa"/>
               <w:left w:w="120" w:type="dxa"/>
@@ -1620,7 +1594,7 @@
                 <w:sz w:val="19"/>
                 <w:szCs w:val="19"/>
               </w:rPr>
-              <w:t>Cyrillic (Russian, Ukrainian, Bulgarian...)</w:t>
+              <w:t>CJK (Chinese, Japanese, Korean)</w:t>
             </w:r>
           </w:p>
         </w:tc>
@@ -1633,7 +1607,7 @@
               <w:bottom w:val="single" w:sz="1" w:space="0" w:color="CCCCCC"/>
               <w:right w:val="single" w:sz="1" w:space="0" w:color="CCCCCC"/>
             </w:tcBorders>
-            <w:shd w:val="clear" w:color="auto" w:fill="FFFFFF"/>
+            <w:shd w:val="clear" w:color="auto" w:fill="EEF4FA"/>
             <w:tcMar>
               <w:top w:w="80" w:type="dxa"/>
               <w:left w:w="120" w:type="dxa"/>
@@ -1648,18 +1622,12 @@
                 <w:sz w:val="19"/>
                 <w:szCs w:val="19"/>
               </w:rPr>
-              <w:t>Adapted for Cyrillic character frequency distribution</w:t>
+              <w:t>Character-level fixation; no sub-character decoding needed</w:t>
             </w:r>
           </w:p>
         </w:tc>
       </w:tr>
       <w:tr>
-        <w:tblPrEx>
-          <w:tblCellMar>
-            <w:top w:w="0" w:type="dxa"/>
-            <w:bottom w:w="0" w:type="dxa"/>
-          </w:tblCellMar>
-        </w:tblPrEx>
         <w:tc>
           <w:tcPr>
             <w:tcW w:w="4200" w:type="dxa"/>
@@ -1669,7 +1637,7 @@
               <w:bottom w:val="single" w:sz="1" w:space="0" w:color="CCCCCC"/>
               <w:right w:val="single" w:sz="1" w:space="0" w:color="CCCCCC"/>
             </w:tcBorders>
-            <w:shd w:val="clear" w:color="auto" w:fill="EEF4FA"/>
+            <w:shd w:val="clear" w:color="auto" w:fill="FFFFFF"/>
             <w:tcMar>
               <w:top w:w="80" w:type="dxa"/>
               <w:left w:w="120" w:type="dxa"/>
@@ -1686,7 +1654,7 @@
                 <w:sz w:val="19"/>
                 <w:szCs w:val="19"/>
               </w:rPr>
-              <w:t>CJK (Chinese, Japanese, Korean)</w:t>
+              <w:t>Arabic / Farsi / Urdu</w:t>
             </w:r>
           </w:p>
         </w:tc>
@@ -1699,7 +1667,7 @@
               <w:bottom w:val="single" w:sz="1" w:space="0" w:color="CCCCCC"/>
               <w:right w:val="single" w:sz="1" w:space="0" w:color="CCCCCC"/>
             </w:tcBorders>
-            <w:shd w:val="clear" w:color="auto" w:fill="EEF4FA"/>
+            <w:shd w:val="clear" w:color="auto" w:fill="FFFFFF"/>
             <w:tcMar>
               <w:top w:w="80" w:type="dxa"/>
               <w:left w:w="120" w:type="dxa"/>
@@ -1714,84 +1682,12 @@
                 <w:sz w:val="19"/>
                 <w:szCs w:val="19"/>
               </w:rPr>
-              <w:t>Character-level fixation; no sub-character decoding needed</w:t>
+              <w:t>Right-to-left adapted; root-morpheme weighted fixation</w:t>
             </w:r>
           </w:p>
         </w:tc>
       </w:tr>
       <w:tr>
-        <w:tblPrEx>
-          <w:tblCellMar>
-            <w:top w:w="0" w:type="dxa"/>
-            <w:bottom w:w="0" w:type="dxa"/>
-          </w:tblCellMar>
-        </w:tblPrEx>
-        <w:tc>
-          <w:tcPr>
-            <w:tcW w:w="4200" w:type="dxa"/>
-            <w:tcBorders>
-              <w:top w:val="single" w:sz="1" w:space="0" w:color="CCCCCC"/>
-              <w:left w:val="single" w:sz="1" w:space="0" w:color="CCCCCC"/>
-              <w:bottom w:val="single" w:sz="1" w:space="0" w:color="CCCCCC"/>
-              <w:right w:val="single" w:sz="1" w:space="0" w:color="CCCCCC"/>
-            </w:tcBorders>
-            <w:shd w:val="clear" w:color="auto" w:fill="FFFFFF"/>
-            <w:tcMar>
-              <w:top w:w="80" w:type="dxa"/>
-              <w:left w:w="120" w:type="dxa"/>
-              <w:bottom w:w="80" w:type="dxa"/>
-              <w:right w:w="120" w:type="dxa"/>
-            </w:tcMar>
-          </w:tcPr>
-          <w:p>
-            <w:r>
-              <w:rPr>
-                <w:b/>
-                <w:bCs/>
-                <w:color w:val="0D1B2A"/>
-                <w:sz w:val="19"/>
-                <w:szCs w:val="19"/>
-              </w:rPr>
-              <w:t>Arabic / Farsi / Urdu</w:t>
-            </w:r>
-          </w:p>
-        </w:tc>
-        <w:tc>
-          <w:tcPr>
-            <w:tcW w:w="5160" w:type="dxa"/>
-            <w:tcBorders>
-              <w:top w:val="single" w:sz="1" w:space="0" w:color="CCCCCC"/>
-              <w:left w:val="single" w:sz="1" w:space="0" w:color="CCCCCC"/>
-              <w:bottom w:val="single" w:sz="1" w:space="0" w:color="CCCCCC"/>
-              <w:right w:val="single" w:sz="1" w:space="0" w:color="CCCCCC"/>
-            </w:tcBorders>
-            <w:shd w:val="clear" w:color="auto" w:fill="FFFFFF"/>
-            <w:tcMar>
-              <w:top w:w="80" w:type="dxa"/>
-              <w:left w:w="120" w:type="dxa"/>
-              <w:bottom w:w="80" w:type="dxa"/>
-              <w:right w:w="120" w:type="dxa"/>
-            </w:tcMar>
-          </w:tcPr>
-          <w:p>
-            <w:r>
-              <w:rPr>
-                <w:color w:val="0D1B2A"/>
-                <w:sz w:val="19"/>
-                <w:szCs w:val="19"/>
-              </w:rPr>
-              <w:t>Right-to-left adapted; root-morpheme weighted fixation</w:t>
-            </w:r>
-          </w:p>
-        </w:tc>
-      </w:tr>
-      <w:tr>
-        <w:tblPrEx>
-          <w:tblCellMar>
-            <w:top w:w="0" w:type="dxa"/>
-            <w:bottom w:w="0" w:type="dxa"/>
-          </w:tblCellMar>
-        </w:tblPrEx>
         <w:tc>
           <w:tcPr>
             <w:tcW w:w="4200" w:type="dxa"/>
@@ -1921,15 +1817,7 @@
       </w:pPr>
       <w:r>
         <w:lastRenderedPageBreak/>
-        <w:t xml:space="preserve">From Research Lab to Spritz </w:t>
-      </w:r>
-      <w:proofErr w:type="gramStart"/>
-      <w:r>
-        <w:t>to</w:t>
-      </w:r>
-      <w:proofErr w:type="gramEnd"/>
-      <w:r>
-        <w:t xml:space="preserve"> Focal</w:t>
+        <w:t>From Research Lab to Spritz to Focal</w:t>
       </w:r>
     </w:p>
     <w:p>
@@ -1957,21 +1845,7 @@
         <w:rPr>
           <w:color w:val="0D1B2A"/>
         </w:rPr>
-        <w:t xml:space="preserve">RSVP as a reading paradigm emerged from cognitive psychology in the 1960s. Forster (1970) and Potter (1984) established it as a rigorous method for studying reading cognition. </w:t>
-      </w:r>
-      <w:proofErr w:type="spellStart"/>
-      <w:r>
-        <w:rPr>
-          <w:color w:val="0D1B2A"/>
-        </w:rPr>
-        <w:t>Brysbaert</w:t>
-      </w:r>
-      <w:proofErr w:type="spellEnd"/>
-      <w:r>
-        <w:rPr>
-          <w:color w:val="0D1B2A"/>
-        </w:rPr>
-        <w:t xml:space="preserve"> &amp; Nazir (1998) quantified the ORP. For decades the technique remained in the laboratory — genuinely useful, but without a delivery mechanism to reach the people who needed it.</w:t>
+        <w:t>RSVP as a reading paradigm emerged from cognitive psychology in the 1960s. Forster (1970) and Potter (1984) established it as a rigorous method for studying reading cognition. Brysbaert &amp; Nazir (1998) quantified the ORP. For decades the technique remained in the laboratory — genuinely useful, but without a delivery mechanism to reach the people who needed it.</w:t>
       </w:r>
     </w:p>
     <w:p/>
@@ -2050,21 +1924,7 @@
         <w:rPr>
           <w:color w:val="0D1B2A"/>
         </w:rPr>
-        <w:t xml:space="preserve">No </w:t>
-      </w:r>
-      <w:proofErr w:type="spellStart"/>
-      <w:r>
-        <w:rPr>
-          <w:color w:val="0D1B2A"/>
-        </w:rPr>
-        <w:t>customisation</w:t>
-      </w:r>
-      <w:proofErr w:type="spellEnd"/>
-      <w:r>
-        <w:rPr>
-          <w:color w:val="0D1B2A"/>
-        </w:rPr>
-        <w:t xml:space="preserve"> — speed, display, and font were largely fixed</w:t>
+        <w:t>No customisation — speed, display, and font were largely fixed</w:t>
       </w:r>
     </w:p>
     <w:p>
@@ -2132,35 +1992,7 @@
         <w:rPr>
           <w:color w:val="0D1B2A"/>
         </w:rPr>
-        <w:t>Following Spritz’s viral moment, a small ecosystem of minimal tools emerged — browser extensions, basic apps</w:t>
-      </w:r>
-      <w:proofErr w:type="gramStart"/>
-      <w:r>
-        <w:rPr>
-          <w:color w:val="0D1B2A"/>
-        </w:rPr>
-        <w:t>, web</w:t>
-      </w:r>
-      <w:proofErr w:type="gramEnd"/>
-      <w:r>
-        <w:rPr>
-          <w:color w:val="0D1B2A"/>
-        </w:rPr>
-        <w:t xml:space="preserve"> utilities. Most treated RSVP as a speed trick. None addressed the full picture: the user with dyslexia who needs an </w:t>
-      </w:r>
-      <w:proofErr w:type="spellStart"/>
-      <w:r>
-        <w:rPr>
-          <w:color w:val="0D1B2A"/>
-        </w:rPr>
-        <w:t>OpenDyslexic</w:t>
-      </w:r>
-      <w:proofErr w:type="spellEnd"/>
-      <w:r>
-        <w:rPr>
-          <w:color w:val="0D1B2A"/>
-        </w:rPr>
-        <w:t xml:space="preserve"> font and a tinted background; the user with ADHD who needs a session timer; the user with processing speed deficits who reads at 80 WPM and needs the tool to meet them there without judgment.</w:t>
+        <w:t>Following Spritz’s viral moment, a small ecosystem of minimal tools emerged — browser extensions, basic apps, web utilities. Most treated RSVP as a speed trick. None addressed the full picture: the user with dyslexia who needs an OpenDyslexic font and a tinted background; the user with ADHD who needs a session timer; the user with processing speed deficits who reads at 80 WPM and needs the tool to meet them there without judgment.</w:t>
       </w:r>
     </w:p>
     <w:p/>
@@ -2184,15 +2016,6 @@
       </w:r>
     </w:p>
     <w:p/>
-    <w:p>
-      <w:pPr>
-        <w:spacing w:before="80" w:after="160"/>
-      </w:pPr>
-      <w:r>
-        <w:lastRenderedPageBreak/>
-        <w:br w:type="page"/>
-      </w:r>
-    </w:p>
     <w:p>
       <w:pPr>
         <w:pStyle w:val="Heading1"/>
@@ -2235,12 +2058,6 @@
         <w:gridCol w:w="1900"/>
       </w:tblGrid>
       <w:tr>
-        <w:tblPrEx>
-          <w:tblCellMar>
-            <w:top w:w="0" w:type="dxa"/>
-            <w:bottom w:w="0" w:type="dxa"/>
-          </w:tblCellMar>
-        </w:tblPrEx>
         <w:tc>
           <w:tcPr>
             <w:tcW w:w="3000" w:type="dxa"/>
@@ -2363,12 +2180,6 @@
         </w:tc>
       </w:tr>
       <w:tr>
-        <w:tblPrEx>
-          <w:tblCellMar>
-            <w:top w:w="0" w:type="dxa"/>
-            <w:bottom w:w="0" w:type="dxa"/>
-          </w:tblCellMar>
-        </w:tblPrEx>
         <w:tc>
           <w:tcPr>
             <w:tcW w:w="3000" w:type="dxa"/>
@@ -2393,25 +2204,7 @@
                 <w:sz w:val="18"/>
                 <w:szCs w:val="18"/>
               </w:rPr>
-              <w:t xml:space="preserve">Offline / no </w:t>
-            </w:r>
-            <w:proofErr w:type="gramStart"/>
-            <w:r>
-              <w:rPr>
-                <w:color w:val="0D1B2A"/>
-                <w:sz w:val="18"/>
-                <w:szCs w:val="18"/>
-              </w:rPr>
-              <w:t>install</w:t>
-            </w:r>
-            <w:proofErr w:type="gramEnd"/>
-            <w:r>
-              <w:rPr>
-                <w:color w:val="0D1B2A"/>
-                <w:sz w:val="18"/>
-                <w:szCs w:val="18"/>
-              </w:rPr>
-              <w:t xml:space="preserve"> required</w:t>
+              <w:t>Offline / no install required</w:t>
             </w:r>
           </w:p>
         </w:tc>
@@ -2503,12 +2296,6 @@
         </w:tc>
       </w:tr>
       <w:tr>
-        <w:tblPrEx>
-          <w:tblCellMar>
-            <w:top w:w="0" w:type="dxa"/>
-            <w:bottom w:w="0" w:type="dxa"/>
-          </w:tblCellMar>
-        </w:tblPrEx>
         <w:tc>
           <w:tcPr>
             <w:tcW w:w="3000" w:type="dxa"/>
@@ -2625,12 +2412,6 @@
         </w:tc>
       </w:tr>
       <w:tr>
-        <w:tblPrEx>
-          <w:tblCellMar>
-            <w:top w:w="0" w:type="dxa"/>
-            <w:bottom w:w="0" w:type="dxa"/>
-          </w:tblCellMar>
-        </w:tblPrEx>
         <w:tc>
           <w:tcPr>
             <w:tcW w:w="3000" w:type="dxa"/>
@@ -2747,12 +2528,6 @@
         </w:tc>
       </w:tr>
       <w:tr>
-        <w:tblPrEx>
-          <w:tblCellMar>
-            <w:top w:w="0" w:type="dxa"/>
-            <w:bottom w:w="0" w:type="dxa"/>
-          </w:tblCellMar>
-        </w:tblPrEx>
         <w:tc>
           <w:tcPr>
             <w:tcW w:w="3000" w:type="dxa"/>
@@ -2869,12 +2644,6 @@
         </w:tc>
       </w:tr>
       <w:tr>
-        <w:tblPrEx>
-          <w:tblCellMar>
-            <w:top w:w="0" w:type="dxa"/>
-            <w:bottom w:w="0" w:type="dxa"/>
-          </w:tblCellMar>
-        </w:tblPrEx>
         <w:tc>
           <w:tcPr>
             <w:tcW w:w="3000" w:type="dxa"/>
@@ -2991,12 +2760,6 @@
         </w:tc>
       </w:tr>
       <w:tr>
-        <w:tblPrEx>
-          <w:tblCellMar>
-            <w:top w:w="0" w:type="dxa"/>
-            <w:bottom w:w="0" w:type="dxa"/>
-          </w:tblCellMar>
-        </w:tblPrEx>
         <w:tc>
           <w:tcPr>
             <w:tcW w:w="3000" w:type="dxa"/>
@@ -3113,12 +2876,6 @@
         </w:tc>
       </w:tr>
       <w:tr>
-        <w:tblPrEx>
-          <w:tblCellMar>
-            <w:top w:w="0" w:type="dxa"/>
-            <w:bottom w:w="0" w:type="dxa"/>
-          </w:tblCellMar>
-        </w:tblPrEx>
         <w:tc>
           <w:tcPr>
             <w:tcW w:w="3000" w:type="dxa"/>
@@ -3235,12 +2992,6 @@
         </w:tc>
       </w:tr>
       <w:tr>
-        <w:tblPrEx>
-          <w:tblCellMar>
-            <w:top w:w="0" w:type="dxa"/>
-            <w:bottom w:w="0" w:type="dxa"/>
-          </w:tblCellMar>
-        </w:tblPrEx>
         <w:tc>
           <w:tcPr>
             <w:tcW w:w="3000" w:type="dxa"/>
@@ -3265,25 +3016,7 @@
                 <w:sz w:val="18"/>
                 <w:szCs w:val="18"/>
               </w:rPr>
-              <w:t>Dyslexia font (</w:t>
-            </w:r>
-            <w:proofErr w:type="spellStart"/>
-            <w:r>
-              <w:rPr>
-                <w:color w:val="0D1B2A"/>
-                <w:sz w:val="18"/>
-                <w:szCs w:val="18"/>
-              </w:rPr>
-              <w:t>OpenDyslexic</w:t>
-            </w:r>
-            <w:proofErr w:type="spellEnd"/>
-            <w:r>
-              <w:rPr>
-                <w:color w:val="0D1B2A"/>
-                <w:sz w:val="18"/>
-                <w:szCs w:val="18"/>
-              </w:rPr>
-              <w:t>)</w:t>
+              <w:t>Dyslexia font (OpenDyslexic)</w:t>
             </w:r>
           </w:p>
         </w:tc>
@@ -3375,12 +3108,6 @@
         </w:tc>
       </w:tr>
       <w:tr>
-        <w:tblPrEx>
-          <w:tblCellMar>
-            <w:top w:w="0" w:type="dxa"/>
-            <w:bottom w:w="0" w:type="dxa"/>
-          </w:tblCellMar>
-        </w:tblPrEx>
         <w:tc>
           <w:tcPr>
             <w:tcW w:w="3000" w:type="dxa"/>
@@ -3497,12 +3224,6 @@
         </w:tc>
       </w:tr>
       <w:tr>
-        <w:tblPrEx>
-          <w:tblCellMar>
-            <w:top w:w="0" w:type="dxa"/>
-            <w:bottom w:w="0" w:type="dxa"/>
-          </w:tblCellMar>
-        </w:tblPrEx>
         <w:tc>
           <w:tcPr>
             <w:tcW w:w="3000" w:type="dxa"/>
@@ -3619,12 +3340,6 @@
         </w:tc>
       </w:tr>
       <w:tr>
-        <w:tblPrEx>
-          <w:tblCellMar>
-            <w:top w:w="0" w:type="dxa"/>
-            <w:bottom w:w="0" w:type="dxa"/>
-          </w:tblCellMar>
-        </w:tblPrEx>
         <w:tc>
           <w:tcPr>
             <w:tcW w:w="3000" w:type="dxa"/>
@@ -3741,12 +3456,6 @@
         </w:tc>
       </w:tr>
       <w:tr>
-        <w:tblPrEx>
-          <w:tblCellMar>
-            <w:top w:w="0" w:type="dxa"/>
-            <w:bottom w:w="0" w:type="dxa"/>
-          </w:tblCellMar>
-        </w:tblPrEx>
         <w:tc>
           <w:tcPr>
             <w:tcW w:w="3000" w:type="dxa"/>
@@ -3863,12 +3572,6 @@
         </w:tc>
       </w:tr>
       <w:tr>
-        <w:tblPrEx>
-          <w:tblCellMar>
-            <w:top w:w="0" w:type="dxa"/>
-            <w:bottom w:w="0" w:type="dxa"/>
-          </w:tblCellMar>
-        </w:tblPrEx>
         <w:tc>
           <w:tcPr>
             <w:tcW w:w="3000" w:type="dxa"/>
@@ -3893,18 +3596,8 @@
                 <w:sz w:val="18"/>
                 <w:szCs w:val="18"/>
               </w:rPr>
-              <w:t xml:space="preserve">AI analysis / </w:t>
-            </w:r>
-            <w:proofErr w:type="spellStart"/>
-            <w:r>
-              <w:rPr>
-                <w:color w:val="0D1B2A"/>
-                <w:sz w:val="18"/>
-                <w:szCs w:val="18"/>
-              </w:rPr>
-              <w:t>summarisation</w:t>
-            </w:r>
-            <w:proofErr w:type="spellEnd"/>
+              <w:t>AI analysis / summarisation</w:t>
+            </w:r>
           </w:p>
         </w:tc>
         <w:tc>
@@ -3995,12 +3688,6 @@
         </w:tc>
       </w:tr>
       <w:tr>
-        <w:tblPrEx>
-          <w:tblCellMar>
-            <w:top w:w="0" w:type="dxa"/>
-            <w:bottom w:w="0" w:type="dxa"/>
-          </w:tblCellMar>
-        </w:tblPrEx>
         <w:tc>
           <w:tcPr>
             <w:tcW w:w="3000" w:type="dxa"/>
@@ -4117,12 +3804,6 @@
         </w:tc>
       </w:tr>
       <w:tr>
-        <w:tblPrEx>
-          <w:tblCellMar>
-            <w:top w:w="0" w:type="dxa"/>
-            <w:bottom w:w="0" w:type="dxa"/>
-          </w:tblCellMar>
-        </w:tblPrEx>
         <w:tc>
           <w:tcPr>
             <w:tcW w:w="3000" w:type="dxa"/>
@@ -4239,12 +3920,6 @@
         </w:tc>
       </w:tr>
       <w:tr>
-        <w:tblPrEx>
-          <w:tblCellMar>
-            <w:top w:w="0" w:type="dxa"/>
-            <w:bottom w:w="0" w:type="dxa"/>
-          </w:tblCellMar>
-        </w:tblPrEx>
         <w:tc>
           <w:tcPr>
             <w:tcW w:w="3000" w:type="dxa"/>
@@ -4361,12 +4036,6 @@
         </w:tc>
       </w:tr>
       <w:tr>
-        <w:tblPrEx>
-          <w:tblCellMar>
-            <w:top w:w="0" w:type="dxa"/>
-            <w:bottom w:w="0" w:type="dxa"/>
-          </w:tblCellMar>
-        </w:tblPrEx>
         <w:tc>
           <w:tcPr>
             <w:tcW w:w="3000" w:type="dxa"/>
@@ -4483,12 +4152,6 @@
         </w:tc>
       </w:tr>
       <w:tr>
-        <w:tblPrEx>
-          <w:tblCellMar>
-            <w:top w:w="0" w:type="dxa"/>
-            <w:bottom w:w="0" w:type="dxa"/>
-          </w:tblCellMar>
-        </w:tblPrEx>
         <w:tc>
           <w:tcPr>
             <w:tcW w:w="3000" w:type="dxa"/>
@@ -4605,12 +4268,6 @@
         </w:tc>
       </w:tr>
       <w:tr>
-        <w:tblPrEx>
-          <w:tblCellMar>
-            <w:top w:w="0" w:type="dxa"/>
-            <w:bottom w:w="0" w:type="dxa"/>
-          </w:tblCellMar>
-        </w:tblPrEx>
         <w:tc>
           <w:tcPr>
             <w:tcW w:w="3000" w:type="dxa"/>
@@ -4727,12 +4384,6 @@
         </w:tc>
       </w:tr>
       <w:tr>
-        <w:tblPrEx>
-          <w:tblCellMar>
-            <w:top w:w="0" w:type="dxa"/>
-            <w:bottom w:w="0" w:type="dxa"/>
-          </w:tblCellMar>
-        </w:tblPrEx>
         <w:tc>
           <w:tcPr>
             <w:tcW w:w="3000" w:type="dxa"/>
@@ -4849,12 +4500,6 @@
         </w:tc>
       </w:tr>
       <w:tr>
-        <w:tblPrEx>
-          <w:tblCellMar>
-            <w:top w:w="0" w:type="dxa"/>
-            <w:bottom w:w="0" w:type="dxa"/>
-          </w:tblCellMar>
-        </w:tblPrEx>
         <w:tc>
           <w:tcPr>
             <w:tcW w:w="3000" w:type="dxa"/>
@@ -4971,12 +4616,6 @@
         </w:tc>
       </w:tr>
       <w:tr>
-        <w:tblPrEx>
-          <w:tblCellMar>
-            <w:top w:w="0" w:type="dxa"/>
-            <w:bottom w:w="0" w:type="dxa"/>
-          </w:tblCellMar>
-        </w:tblPrEx>
         <w:tc>
           <w:tcPr>
             <w:tcW w:w="3000" w:type="dxa"/>
@@ -5136,21 +4775,7 @@
         <w:rPr>
           <w:color w:val="0D1B2A"/>
         </w:rPr>
-        <w:t xml:space="preserve">The most important insight in </w:t>
-      </w:r>
-      <w:proofErr w:type="spellStart"/>
-      <w:r>
-        <w:rPr>
-          <w:color w:val="0D1B2A"/>
-        </w:rPr>
-        <w:t>Focal’s</w:t>
-      </w:r>
-      <w:proofErr w:type="spellEnd"/>
-      <w:r>
-        <w:rPr>
-          <w:color w:val="0D1B2A"/>
-        </w:rPr>
-        <w:t xml:space="preserve"> investment thesis is not about dyslexia. It is about the pattern of innovation that dyslexia-first design represents.</w:t>
+        <w:t>The most important insight in Focal’s investment thesis is not about dyslexia. It is about the pattern of innovation that dyslexia-first design represents.</w:t>
       </w:r>
     </w:p>
     <w:p>
@@ -5187,12 +4812,6 @@
         <w:gridCol w:w="5960"/>
       </w:tblGrid>
       <w:tr>
-        <w:tblPrEx>
-          <w:tblCellMar>
-            <w:top w:w="0" w:type="dxa"/>
-            <w:bottom w:w="0" w:type="dxa"/>
-          </w:tblCellMar>
-        </w:tblPrEx>
         <w:tc>
           <w:tcPr>
             <w:tcW w:w="3400" w:type="dxa"/>
@@ -5255,12 +4874,6 @@
         </w:tc>
       </w:tr>
       <w:tr>
-        <w:tblPrEx>
-          <w:tblCellMar>
-            <w:top w:w="0" w:type="dxa"/>
-            <w:bottom w:w="0" w:type="dxa"/>
-          </w:tblCellMar>
-        </w:tblPrEx>
         <w:tc>
           <w:tcPr>
             <w:tcW w:w="3400" w:type="dxa"/>
@@ -5321,12 +4934,6 @@
         </w:tc>
       </w:tr>
       <w:tr>
-        <w:tblPrEx>
-          <w:tblCellMar>
-            <w:top w:w="0" w:type="dxa"/>
-            <w:bottom w:w="0" w:type="dxa"/>
-          </w:tblCellMar>
-        </w:tblPrEx>
         <w:tc>
           <w:tcPr>
             <w:tcW w:w="3400" w:type="dxa"/>
@@ -5387,12 +4994,6 @@
         </w:tc>
       </w:tr>
       <w:tr>
-        <w:tblPrEx>
-          <w:tblCellMar>
-            <w:top w:w="0" w:type="dxa"/>
-            <w:bottom w:w="0" w:type="dxa"/>
-          </w:tblCellMar>
-        </w:tblPrEx>
         <w:tc>
           <w:tcPr>
             <w:tcW w:w="3400" w:type="dxa"/>
@@ -5453,12 +5054,6 @@
         </w:tc>
       </w:tr>
       <w:tr>
-        <w:tblPrEx>
-          <w:tblCellMar>
-            <w:top w:w="0" w:type="dxa"/>
-            <w:bottom w:w="0" w:type="dxa"/>
-          </w:tblCellMar>
-        </w:tblPrEx>
         <w:tc>
           <w:tcPr>
             <w:tcW w:w="3400" w:type="dxa"/>
@@ -5513,36 +5108,72 @@
                 <w:sz w:val="19"/>
                 <w:szCs w:val="19"/>
               </w:rPr>
-              <w:t xml:space="preserve">Deaf and hard-of-hearing viewers → millions watching </w:t>
-            </w:r>
-            <w:proofErr w:type="gramStart"/>
-            <w:r>
-              <w:rPr>
+              <w:t>Deaf and hard-of-hearing viewers → millions watching video in public, noisy spaces</w:t>
+            </w:r>
+          </w:p>
+        </w:tc>
+      </w:tr>
+      <w:tr>
+        <w:tc>
+          <w:tcPr>
+            <w:tcW w:w="3400" w:type="dxa"/>
+            <w:tcBorders>
+              <w:top w:val="single" w:sz="1" w:space="0" w:color="CCCCCC"/>
+              <w:left w:val="single" w:sz="1" w:space="0" w:color="CCCCCC"/>
+              <w:bottom w:val="single" w:sz="1" w:space="0" w:color="CCCCCC"/>
+              <w:right w:val="single" w:sz="1" w:space="0" w:color="CCCCCC"/>
+            </w:tcBorders>
+            <w:shd w:val="clear" w:color="auto" w:fill="EEF4FA"/>
+            <w:tcMar>
+              <w:top w:w="80" w:type="dxa"/>
+              <w:left w:w="120" w:type="dxa"/>
+              <w:bottom w:w="80" w:type="dxa"/>
+              <w:right w:w="120" w:type="dxa"/>
+            </w:tcMar>
+          </w:tcPr>
+          <w:p>
+            <w:r>
+              <w:rPr>
+                <w:b/>
+                <w:bCs/>
                 <w:color w:val="0D1B2A"/>
                 <w:sz w:val="19"/>
                 <w:szCs w:val="19"/>
               </w:rPr>
-              <w:t>video</w:t>
-            </w:r>
-            <w:proofErr w:type="gramEnd"/>
+              <w:t>Curb cuts</w:t>
+            </w:r>
+          </w:p>
+        </w:tc>
+        <w:tc>
+          <w:tcPr>
+            <w:tcW w:w="5960" w:type="dxa"/>
+            <w:tcBorders>
+              <w:top w:val="single" w:sz="1" w:space="0" w:color="CCCCCC"/>
+              <w:left w:val="single" w:sz="1" w:space="0" w:color="CCCCCC"/>
+              <w:bottom w:val="single" w:sz="1" w:space="0" w:color="CCCCCC"/>
+              <w:right w:val="single" w:sz="1" w:space="0" w:color="CCCCCC"/>
+            </w:tcBorders>
+            <w:shd w:val="clear" w:color="auto" w:fill="EEF4FA"/>
+            <w:tcMar>
+              <w:top w:w="80" w:type="dxa"/>
+              <w:left w:w="120" w:type="dxa"/>
+              <w:bottom w:w="80" w:type="dxa"/>
+              <w:right w:w="120" w:type="dxa"/>
+            </w:tcMar>
+          </w:tcPr>
+          <w:p>
             <w:r>
               <w:rPr>
                 <w:color w:val="0D1B2A"/>
                 <w:sz w:val="19"/>
                 <w:szCs w:val="19"/>
               </w:rPr>
-              <w:t xml:space="preserve"> in public, noisy spaces</w:t>
+              <w:t>Required by disability advocates for wheelchair access → cyclists, parents, delivery workers</w:t>
             </w:r>
           </w:p>
         </w:tc>
       </w:tr>
       <w:tr>
-        <w:tblPrEx>
-          <w:tblCellMar>
-            <w:top w:w="0" w:type="dxa"/>
-            <w:bottom w:w="0" w:type="dxa"/>
-          </w:tblCellMar>
-        </w:tblPrEx>
         <w:tc>
           <w:tcPr>
             <w:tcW w:w="3400" w:type="dxa"/>
@@ -5552,7 +5183,7 @@
               <w:bottom w:val="single" w:sz="1" w:space="0" w:color="CCCCCC"/>
               <w:right w:val="single" w:sz="1" w:space="0" w:color="CCCCCC"/>
             </w:tcBorders>
-            <w:shd w:val="clear" w:color="auto" w:fill="EEF4FA"/>
+            <w:shd w:val="clear" w:color="auto" w:fill="FFFFFF"/>
             <w:tcMar>
               <w:top w:w="80" w:type="dxa"/>
               <w:left w:w="120" w:type="dxa"/>
@@ -5569,7 +5200,7 @@
                 <w:sz w:val="19"/>
                 <w:szCs w:val="19"/>
               </w:rPr>
-              <w:t>Curb cuts</w:t>
+              <w:t>Autocorrect</w:t>
             </w:r>
           </w:p>
         </w:tc>
@@ -5582,7 +5213,7 @@
               <w:bottom w:val="single" w:sz="1" w:space="0" w:color="CCCCCC"/>
               <w:right w:val="single" w:sz="1" w:space="0" w:color="CCCCCC"/>
             </w:tcBorders>
-            <w:shd w:val="clear" w:color="auto" w:fill="EEF4FA"/>
+            <w:shd w:val="clear" w:color="auto" w:fill="FFFFFF"/>
             <w:tcMar>
               <w:top w:w="80" w:type="dxa"/>
               <w:left w:w="120" w:type="dxa"/>
@@ -5597,18 +5228,12 @@
                 <w:sz w:val="19"/>
                 <w:szCs w:val="19"/>
               </w:rPr>
-              <w:t>Required by disability advocates for wheelchair access → cyclists, parents, delivery workers</w:t>
+              <w:t>Originally a keyboard accessibility feature for motor-impaired users → every smartphone</w:t>
             </w:r>
           </w:p>
         </w:tc>
       </w:tr>
       <w:tr>
-        <w:tblPrEx>
-          <w:tblCellMar>
-            <w:top w:w="0" w:type="dxa"/>
-            <w:bottom w:w="0" w:type="dxa"/>
-          </w:tblCellMar>
-        </w:tblPrEx>
         <w:tc>
           <w:tcPr>
             <w:tcW w:w="3400" w:type="dxa"/>
@@ -5618,7 +5243,7 @@
               <w:bottom w:val="single" w:sz="1" w:space="0" w:color="CCCCCC"/>
               <w:right w:val="single" w:sz="1" w:space="0" w:color="CCCCCC"/>
             </w:tcBorders>
-            <w:shd w:val="clear" w:color="auto" w:fill="FFFFFF"/>
+            <w:shd w:val="clear" w:color="auto" w:fill="EEF4FA"/>
             <w:tcMar>
               <w:top w:w="80" w:type="dxa"/>
               <w:left w:w="120" w:type="dxa"/>
@@ -5635,7 +5260,7 @@
                 <w:sz w:val="19"/>
                 <w:szCs w:val="19"/>
               </w:rPr>
-              <w:t>Autocorrect</w:t>
+              <w:t>Voice assistants (Siri, Alexa)</w:t>
             </w:r>
           </w:p>
         </w:tc>
@@ -5648,7 +5273,7 @@
               <w:bottom w:val="single" w:sz="1" w:space="0" w:color="CCCCCC"/>
               <w:right w:val="single" w:sz="1" w:space="0" w:color="CCCCCC"/>
             </w:tcBorders>
-            <w:shd w:val="clear" w:color="auto" w:fill="FFFFFF"/>
+            <w:shd w:val="clear" w:color="auto" w:fill="EEF4FA"/>
             <w:tcMar>
               <w:top w:w="80" w:type="dxa"/>
               <w:left w:w="120" w:type="dxa"/>
@@ -5663,84 +5288,12 @@
                 <w:sz w:val="19"/>
                 <w:szCs w:val="19"/>
               </w:rPr>
-              <w:t>Originally a keyboard accessibility feature for motor-impaired users → every smartphone</w:t>
+              <w:t>Motor and visual accessibility → mainstream consumer products, billions of users</w:t>
             </w:r>
           </w:p>
         </w:tc>
       </w:tr>
       <w:tr>
-        <w:tblPrEx>
-          <w:tblCellMar>
-            <w:top w:w="0" w:type="dxa"/>
-            <w:bottom w:w="0" w:type="dxa"/>
-          </w:tblCellMar>
-        </w:tblPrEx>
-        <w:tc>
-          <w:tcPr>
-            <w:tcW w:w="3400" w:type="dxa"/>
-            <w:tcBorders>
-              <w:top w:val="single" w:sz="1" w:space="0" w:color="CCCCCC"/>
-              <w:left w:val="single" w:sz="1" w:space="0" w:color="CCCCCC"/>
-              <w:bottom w:val="single" w:sz="1" w:space="0" w:color="CCCCCC"/>
-              <w:right w:val="single" w:sz="1" w:space="0" w:color="CCCCCC"/>
-            </w:tcBorders>
-            <w:shd w:val="clear" w:color="auto" w:fill="EEF4FA"/>
-            <w:tcMar>
-              <w:top w:w="80" w:type="dxa"/>
-              <w:left w:w="120" w:type="dxa"/>
-              <w:bottom w:w="80" w:type="dxa"/>
-              <w:right w:w="120" w:type="dxa"/>
-            </w:tcMar>
-          </w:tcPr>
-          <w:p>
-            <w:r>
-              <w:rPr>
-                <w:b/>
-                <w:bCs/>
-                <w:color w:val="0D1B2A"/>
-                <w:sz w:val="19"/>
-                <w:szCs w:val="19"/>
-              </w:rPr>
-              <w:t>Voice assistants (Siri, Alexa)</w:t>
-            </w:r>
-          </w:p>
-        </w:tc>
-        <w:tc>
-          <w:tcPr>
-            <w:tcW w:w="5960" w:type="dxa"/>
-            <w:tcBorders>
-              <w:top w:val="single" w:sz="1" w:space="0" w:color="CCCCCC"/>
-              <w:left w:val="single" w:sz="1" w:space="0" w:color="CCCCCC"/>
-              <w:bottom w:val="single" w:sz="1" w:space="0" w:color="CCCCCC"/>
-              <w:right w:val="single" w:sz="1" w:space="0" w:color="CCCCCC"/>
-            </w:tcBorders>
-            <w:shd w:val="clear" w:color="auto" w:fill="EEF4FA"/>
-            <w:tcMar>
-              <w:top w:w="80" w:type="dxa"/>
-              <w:left w:w="120" w:type="dxa"/>
-              <w:bottom w:w="80" w:type="dxa"/>
-              <w:right w:w="120" w:type="dxa"/>
-            </w:tcMar>
-          </w:tcPr>
-          <w:p>
-            <w:r>
-              <w:rPr>
-                <w:color w:val="0D1B2A"/>
-                <w:sz w:val="19"/>
-                <w:szCs w:val="19"/>
-              </w:rPr>
-              <w:t>Motor and visual accessibility → mainstream consumer products, billions of users</w:t>
-            </w:r>
-          </w:p>
-        </w:tc>
-      </w:tr>
-      <w:tr>
-        <w:tblPrEx>
-          <w:tblCellMar>
-            <w:top w:w="0" w:type="dxa"/>
-            <w:bottom w:w="0" w:type="dxa"/>
-          </w:tblCellMar>
-        </w:tblPrEx>
         <w:tc>
           <w:tcPr>
             <w:tcW w:w="3400" w:type="dxa"/>
@@ -5810,35 +5363,7 @@
         <w:rPr>
           <w:color w:val="0D1B2A"/>
         </w:rPr>
-        <w:t xml:space="preserve">This phenomenon is called the Curb Cut Effect: design for </w:t>
-      </w:r>
-      <w:proofErr w:type="gramStart"/>
-      <w:r>
-        <w:rPr>
-          <w:color w:val="0D1B2A"/>
-        </w:rPr>
-        <w:t>the margins</w:t>
-      </w:r>
-      <w:proofErr w:type="gramEnd"/>
-      <w:r>
-        <w:rPr>
-          <w:color w:val="0D1B2A"/>
-        </w:rPr>
-        <w:t xml:space="preserve">, improve the </w:t>
-      </w:r>
-      <w:proofErr w:type="spellStart"/>
-      <w:r>
-        <w:rPr>
-          <w:color w:val="0D1B2A"/>
-        </w:rPr>
-        <w:t>centre</w:t>
-      </w:r>
-      <w:proofErr w:type="spellEnd"/>
-      <w:r>
-        <w:rPr>
-          <w:color w:val="0D1B2A"/>
-        </w:rPr>
-        <w:t>.</w:t>
+        <w:t>This phenomenon is called the Curb Cut Effect: design for the margins, improve the centre.</w:t>
       </w:r>
     </w:p>
     <w:tbl>
@@ -5863,12 +5388,6 @@
         <w:gridCol w:w="7920"/>
       </w:tblGrid>
       <w:tr>
-        <w:tblPrEx>
-          <w:tblCellMar>
-            <w:top w:w="0" w:type="dxa"/>
-            <w:bottom w:w="0" w:type="dxa"/>
-          </w:tblCellMar>
-        </w:tblPrEx>
         <w:tc>
           <w:tcPr>
             <w:tcW w:w="1440" w:type="dxa"/>
@@ -5925,35 +5444,7 @@
               <w:rPr>
                 <w:color w:val="0D1B2A"/>
               </w:rPr>
-              <w:t xml:space="preserve">RSVP technology follows the same arc. </w:t>
-            </w:r>
-            <w:proofErr w:type="gramStart"/>
-            <w:r>
-              <w:rPr>
-                <w:color w:val="0D1B2A"/>
-              </w:rPr>
-              <w:t>Studied</w:t>
-            </w:r>
-            <w:proofErr w:type="gramEnd"/>
-            <w:r>
-              <w:rPr>
-                <w:color w:val="0D1B2A"/>
-              </w:rPr>
-              <w:t xml:space="preserve"> for decades as a tool for readers for whom standard text was inaccessible. Focal makes it available to everyone — with the people who need it most at the </w:t>
-            </w:r>
-            <w:proofErr w:type="spellStart"/>
-            <w:r>
-              <w:rPr>
-                <w:color w:val="0D1B2A"/>
-              </w:rPr>
-              <w:t>centre</w:t>
-            </w:r>
-            <w:proofErr w:type="spellEnd"/>
-            <w:r>
-              <w:rPr>
-                <w:color w:val="0D1B2A"/>
-              </w:rPr>
-              <w:t xml:space="preserve"> of the design, not the footnote.</w:t>
+              <w:t>RSVP technology follows the same arc. Studied for decades as a tool for readers for whom standard text was inaccessible. Focal makes it available to everyone — with the people who need it most at the centre of the design, not the footnote.</w:t>
             </w:r>
           </w:p>
         </w:tc>
@@ -5968,72 +5459,7 @@
         <w:rPr>
           <w:color w:val="0D1B2A"/>
         </w:rPr>
-        <w:t xml:space="preserve">The commercial logic is direct: a tool built with genuine accessibility </w:t>
-      </w:r>
-      <w:proofErr w:type="spellStart"/>
-      <w:r>
-        <w:rPr>
-          <w:color w:val="0D1B2A"/>
-        </w:rPr>
-        <w:t>rigour</w:t>
-      </w:r>
-      <w:proofErr w:type="spellEnd"/>
-      <w:r>
-        <w:rPr>
-          <w:color w:val="0D1B2A"/>
-        </w:rPr>
-        <w:t xml:space="preserve"> is also, necessarily, a tool built with exceptional attention to </w:t>
-      </w:r>
-      <w:proofErr w:type="spellStart"/>
-      <w:r>
-        <w:rPr>
-          <w:color w:val="0D1B2A"/>
-        </w:rPr>
-        <w:t>customisation</w:t>
-      </w:r>
-      <w:proofErr w:type="spellEnd"/>
-      <w:r>
-        <w:rPr>
-          <w:color w:val="0D1B2A"/>
-        </w:rPr>
-        <w:t xml:space="preserve">, flexibility, and user experience. Accessibility requirements are the most demanding UX brief in existence. When you </w:t>
-      </w:r>
-      <w:proofErr w:type="gramStart"/>
-      <w:r>
-        <w:rPr>
-          <w:color w:val="0D1B2A"/>
-        </w:rPr>
-        <w:t>solve for</w:t>
-      </w:r>
-      <w:proofErr w:type="gramEnd"/>
-      <w:r>
-        <w:rPr>
-          <w:color w:val="0D1B2A"/>
-        </w:rPr>
-        <w:t xml:space="preserve"> them, you </w:t>
-      </w:r>
-      <w:proofErr w:type="gramStart"/>
-      <w:r>
-        <w:rPr>
-          <w:color w:val="0D1B2A"/>
-        </w:rPr>
-        <w:t>solve</w:t>
-      </w:r>
-      <w:proofErr w:type="gramEnd"/>
-      <w:r>
-        <w:rPr>
-          <w:color w:val="0D1B2A"/>
-        </w:rPr>
-        <w:t xml:space="preserve"> for everyone.</w:t>
-      </w:r>
-    </w:p>
-    <w:p/>
-    <w:p>
-      <w:pPr>
-        <w:spacing w:before="80" w:after="160"/>
-      </w:pPr>
-      <w:r>
-        <w:br w:type="page"/>
+        <w:t>The commercial logic is direct: a tool built with genuine accessibility rigour is also, necessarily, a tool built with exceptional attention to customisation, flexibility, and user experience. Accessibility requirements are the most demanding UX brief in existence. When you solve for them, you solve for everyone.</w:t>
       </w:r>
     </w:p>
     <w:p>
@@ -6059,15 +5485,7 @@
         <w:pStyle w:val="Heading2"/>
       </w:pPr>
       <w:r>
-        <w:t xml:space="preserve">A Platform, </w:t>
-      </w:r>
-      <w:proofErr w:type="gramStart"/>
-      <w:r>
-        <w:t>Not</w:t>
-      </w:r>
-      <w:proofErr w:type="gramEnd"/>
-      <w:r>
-        <w:t xml:space="preserve"> a Feature</w:t>
+        <w:t>A Platform, Not a Feature</w:t>
       </w:r>
     </w:p>
     <w:p>
@@ -6078,49 +5496,7 @@
         <w:rPr>
           <w:color w:val="0D1B2A"/>
         </w:rPr>
-        <w:t xml:space="preserve">Focal is a single-file Progressive Web App. It </w:t>
-      </w:r>
-      <w:proofErr w:type="gramStart"/>
-      <w:r>
-        <w:rPr>
-          <w:color w:val="0D1B2A"/>
-        </w:rPr>
-        <w:t>installs</w:t>
-      </w:r>
-      <w:proofErr w:type="gramEnd"/>
-      <w:r>
-        <w:rPr>
-          <w:color w:val="0D1B2A"/>
-        </w:rPr>
-        <w:t xml:space="preserve"> on any device, works fully offline, and requires no account, subscription, or infrastructure to use. All user data — preferences, library texts, session history — is stored in </w:t>
-      </w:r>
-      <w:proofErr w:type="spellStart"/>
-      <w:r>
-        <w:rPr>
-          <w:color w:val="0D1B2A"/>
-        </w:rPr>
-        <w:t>localStorage</w:t>
-      </w:r>
-      <w:proofErr w:type="spellEnd"/>
-      <w:r>
-        <w:rPr>
-          <w:color w:val="0D1B2A"/>
-        </w:rPr>
-        <w:t xml:space="preserve"> and </w:t>
-      </w:r>
-      <w:proofErr w:type="spellStart"/>
-      <w:r>
-        <w:rPr>
-          <w:color w:val="0D1B2A"/>
-        </w:rPr>
-        <w:t>IndexedDB</w:t>
-      </w:r>
-      <w:proofErr w:type="spellEnd"/>
-      <w:r>
-        <w:rPr>
-          <w:color w:val="0D1B2A"/>
-        </w:rPr>
-        <w:t xml:space="preserve"> on the device. Nothing leaves the browser.</w:t>
+        <w:t>Focal is a single-file Progressive Web App. It installs on any device, works fully offline, and requires no account, subscription, or infrastructure to use. All user data — preferences, library texts, session history — is stored in localStorage and IndexedDB on the device. Nothing leaves the browser.</w:t>
       </w:r>
     </w:p>
     <w:p/>
@@ -6262,19 +5638,11 @@
         </w:numPr>
         <w:spacing w:before="40" w:after="80"/>
       </w:pPr>
-      <w:proofErr w:type="spellStart"/>
-      <w:r>
-        <w:rPr>
-          <w:color w:val="0D1B2A"/>
-        </w:rPr>
-        <w:t>OpenDyslexic</w:t>
-      </w:r>
-      <w:proofErr w:type="spellEnd"/>
-      <w:r>
-        <w:rPr>
-          <w:color w:val="0D1B2A"/>
-        </w:rPr>
-        <w:t xml:space="preserve"> font toggle</w:t>
+      <w:r>
+        <w:rPr>
+          <w:color w:val="0D1B2A"/>
+        </w:rPr>
+        <w:t>OpenDyslexic font toggle</w:t>
       </w:r>
     </w:p>
     <w:p>
@@ -6322,21 +5690,7 @@
         <w:rPr>
           <w:color w:val="0D1B2A"/>
         </w:rPr>
-        <w:t xml:space="preserve">Dark / light themes with per-theme </w:t>
-      </w:r>
-      <w:proofErr w:type="spellStart"/>
-      <w:r>
-        <w:rPr>
-          <w:color w:val="0D1B2A"/>
-        </w:rPr>
-        <w:t>colour</w:t>
-      </w:r>
-      <w:proofErr w:type="spellEnd"/>
-      <w:r>
-        <w:rPr>
-          <w:color w:val="0D1B2A"/>
-        </w:rPr>
-        <w:t xml:space="preserve"> inheritance</w:t>
+        <w:t>Dark / light themes with per-theme colour inheritance</w:t>
       </w:r>
     </w:p>
     <w:p>
@@ -6352,49 +5706,7 @@
         <w:rPr>
           <w:color w:val="0D1B2A"/>
         </w:rPr>
-        <w:t xml:space="preserve">Accent </w:t>
-      </w:r>
-      <w:proofErr w:type="spellStart"/>
-      <w:r>
-        <w:rPr>
-          <w:color w:val="0D1B2A"/>
-        </w:rPr>
-        <w:t>colour</w:t>
-      </w:r>
-      <w:proofErr w:type="spellEnd"/>
-      <w:r>
-        <w:rPr>
-          <w:color w:val="0D1B2A"/>
-        </w:rPr>
-        <w:t xml:space="preserve"> </w:t>
-      </w:r>
-      <w:proofErr w:type="spellStart"/>
-      <w:r>
-        <w:rPr>
-          <w:color w:val="0D1B2A"/>
-        </w:rPr>
-        <w:t>customisation</w:t>
-      </w:r>
-      <w:proofErr w:type="spellEnd"/>
-      <w:r>
-        <w:rPr>
-          <w:color w:val="0D1B2A"/>
-        </w:rPr>
-        <w:t xml:space="preserve"> with </w:t>
-      </w:r>
-      <w:proofErr w:type="spellStart"/>
-      <w:r>
-        <w:rPr>
-          <w:color w:val="0D1B2A"/>
-        </w:rPr>
-        <w:t>colour</w:t>
-      </w:r>
-      <w:proofErr w:type="spellEnd"/>
-      <w:r>
-        <w:rPr>
-          <w:color w:val="0D1B2A"/>
-        </w:rPr>
-        <w:t>-blind-friendly presets</w:t>
+        <w:t>Accent colour customisation with colour-blind-friendly presets</w:t>
       </w:r>
     </w:p>
     <w:p>
@@ -6451,35 +5763,7 @@
         <w:rPr>
           <w:color w:val="0D1B2A"/>
         </w:rPr>
-        <w:t xml:space="preserve">AI analysis powered by </w:t>
-      </w:r>
-      <w:proofErr w:type="spellStart"/>
-      <w:r>
-        <w:rPr>
-          <w:color w:val="0D1B2A"/>
-        </w:rPr>
-        <w:t>Groq</w:t>
-      </w:r>
-      <w:proofErr w:type="spellEnd"/>
-      <w:r>
-        <w:rPr>
-          <w:color w:val="0D1B2A"/>
-        </w:rPr>
-        <w:t xml:space="preserve"> (Llama 3.3 70</w:t>
-      </w:r>
-      <w:proofErr w:type="gramStart"/>
-      <w:r>
-        <w:rPr>
-          <w:color w:val="0D1B2A"/>
-        </w:rPr>
-        <w:t>B) —</w:t>
-      </w:r>
-      <w:proofErr w:type="gramEnd"/>
-      <w:r>
-        <w:rPr>
-          <w:color w:val="0D1B2A"/>
-        </w:rPr>
-        <w:t xml:space="preserve"> ultra-low latency inference</w:t>
+        <w:t>AI analysis powered by Groq (Llama 3.3 70B) — ultra-low latency inference</w:t>
       </w:r>
     </w:p>
     <w:p>
@@ -6507,19 +5791,11 @@
         </w:numPr>
         <w:spacing w:before="40" w:after="80"/>
       </w:pPr>
-      <w:proofErr w:type="spellStart"/>
-      <w:r>
-        <w:rPr>
-          <w:color w:val="0D1B2A"/>
-        </w:rPr>
-        <w:t>Summarise</w:t>
-      </w:r>
-      <w:proofErr w:type="spellEnd"/>
-      <w:r>
-        <w:rPr>
-          <w:color w:val="0D1B2A"/>
-        </w:rPr>
-        <w:t>, Key Points, Explain Simply, Reading Level, Comprehension Check</w:t>
+      <w:r>
+        <w:rPr>
+          <w:color w:val="0D1B2A"/>
+        </w:rPr>
+        <w:t>Summarise, Key Points, Explain Simply, Reading Level, Comprehension Check</w:t>
       </w:r>
     </w:p>
     <w:p>
@@ -6551,21 +5827,7 @@
         <w:rPr>
           <w:color w:val="0D1B2A"/>
         </w:rPr>
-        <w:t>Import from TXT, PDF (PDF.js), EPUB (</w:t>
-      </w:r>
-      <w:proofErr w:type="spellStart"/>
-      <w:r>
-        <w:rPr>
-          <w:color w:val="0D1B2A"/>
-        </w:rPr>
-        <w:t>JSZip</w:t>
-      </w:r>
-      <w:proofErr w:type="spellEnd"/>
-      <w:r>
-        <w:rPr>
-          <w:color w:val="0D1B2A"/>
-        </w:rPr>
-        <w:t>), DOCX (Mammoth.js), Markdown, RTF, HTML, CSV, and URL fetch</w:t>
+        <w:t>Import from TXT, PDF (PDF.js), EPUB (JSZip), DOCX (Mammoth.js), Markdown, RTF, HTML, CSV, and URL fetch</w:t>
       </w:r>
     </w:p>
     <w:p/>
@@ -6743,21 +6005,7 @@
         <w:rPr>
           <w:color w:val="0D1B2A"/>
         </w:rPr>
-        <w:t xml:space="preserve">Focus Timer </w:t>
-      </w:r>
-      <w:proofErr w:type="gramStart"/>
-      <w:r>
-        <w:rPr>
-          <w:color w:val="0D1B2A"/>
-        </w:rPr>
-        <w:t>in</w:t>
-      </w:r>
-      <w:proofErr w:type="gramEnd"/>
-      <w:r>
-        <w:rPr>
-          <w:color w:val="0D1B2A"/>
-        </w:rPr>
-        <w:t xml:space="preserve"> header: full Pomodoro with rounds, long breaks, auto-start, progress ring</w:t>
+        <w:t>Focus Timer in header: full Pomodoro with rounds, long breaks, auto-start, progress ring</w:t>
       </w:r>
     </w:p>
     <w:p>
@@ -6843,12 +6091,6 @@
         <w:gridCol w:w="2340"/>
       </w:tblGrid>
       <w:tr>
-        <w:tblPrEx>
-          <w:tblCellMar>
-            <w:top w:w="0" w:type="dxa"/>
-            <w:bottom w:w="0" w:type="dxa"/>
-          </w:tblCellMar>
-        </w:tblPrEx>
         <w:tc>
           <w:tcPr>
             <w:tcW w:w="2340" w:type="dxa"/>
@@ -6987,12 +6229,6 @@
         </w:tc>
       </w:tr>
       <w:tr>
-        <w:tblPrEx>
-          <w:tblCellMar>
-            <w:top w:w="0" w:type="dxa"/>
-            <w:bottom w:w="0" w:type="dxa"/>
-          </w:tblCellMar>
-        </w:tblPrEx>
         <w:tc>
           <w:tcPr>
             <w:tcW w:w="2340" w:type="dxa"/>
@@ -7241,49 +6477,7 @@
         <w:rPr>
           <w:color w:val="0D1B2A"/>
         </w:rPr>
-        <w:t xml:space="preserve">Because Focal is free and </w:t>
-      </w:r>
-      <w:proofErr w:type="gramStart"/>
-      <w:r>
-        <w:rPr>
-          <w:color w:val="0D1B2A"/>
-        </w:rPr>
-        <w:t>single-file</w:t>
-      </w:r>
-      <w:proofErr w:type="gramEnd"/>
-      <w:r>
-        <w:rPr>
-          <w:color w:val="0D1B2A"/>
-        </w:rPr>
-        <w:t xml:space="preserve">, it </w:t>
-      </w:r>
-      <w:proofErr w:type="gramStart"/>
-      <w:r>
-        <w:rPr>
-          <w:color w:val="0D1B2A"/>
-        </w:rPr>
-        <w:t>distributes</w:t>
-      </w:r>
-      <w:proofErr w:type="gramEnd"/>
-      <w:r>
-        <w:rPr>
-          <w:color w:val="0D1B2A"/>
-        </w:rPr>
-        <w:t xml:space="preserve"> through any channel: school districts, hospital patient portals, corporate HR platforms, public library systems, government accessibility </w:t>
-      </w:r>
-      <w:proofErr w:type="spellStart"/>
-      <w:r>
-        <w:rPr>
-          <w:color w:val="0D1B2A"/>
-        </w:rPr>
-        <w:t>programmes</w:t>
-      </w:r>
-      <w:proofErr w:type="spellEnd"/>
-      <w:r>
-        <w:rPr>
-          <w:color w:val="0D1B2A"/>
-        </w:rPr>
-        <w:t>. There is no friction. No download. No account. You share a link and it works.</w:t>
+        <w:t>Because Focal is free and single-file, it distributes through any channel: school districts, hospital patient portals, corporate HR platforms, public library systems, government accessibility programmes. There is no friction. No download. No account. You share a link and it works.</w:t>
       </w:r>
     </w:p>
     <w:p/>
@@ -7348,29 +6542,13 @@
           <w:bCs/>
           <w:color w:val="0D1B2A"/>
         </w:rPr>
-        <w:t xml:space="preserve"> Premium tier — advanced AI features, team libraries, cross-device </w:t>
-      </w:r>
-      <w:proofErr w:type="spellStart"/>
-      <w:r>
-        <w:rPr>
-          <w:b/>
-          <w:bCs/>
-          <w:color w:val="0D1B2A"/>
-        </w:rPr>
-        <w:t>sync</w:t>
-      </w:r>
-      <w:r>
-        <w:rPr>
-          <w:color w:val="0D1B2A"/>
-        </w:rPr>
-        <w:t>Focal</w:t>
-      </w:r>
-      <w:proofErr w:type="spellEnd"/>
-      <w:r>
-        <w:rPr>
-          <w:color w:val="0D1B2A"/>
-        </w:rPr>
-        <w:t xml:space="preserve"> Pro:</w:t>
+        <w:t xml:space="preserve"> Premium tier — advanced AI features, team libraries, cross-device sync</w:t>
+      </w:r>
+      <w:r>
+        <w:rPr>
+          <w:color w:val="0D1B2A"/>
+        </w:rPr>
+        <w:t>Focal Pro:</w:t>
       </w:r>
     </w:p>
     <w:p>
@@ -7388,29 +6566,13 @@
           <w:bCs/>
           <w:color w:val="0D1B2A"/>
         </w:rPr>
-        <w:t xml:space="preserve"> School district licensing with teacher dashboards, reading progress tracking, and IEP </w:t>
-      </w:r>
-      <w:proofErr w:type="spellStart"/>
-      <w:r>
-        <w:rPr>
-          <w:b/>
-          <w:bCs/>
-          <w:color w:val="0D1B2A"/>
-        </w:rPr>
-        <w:t>integration</w:t>
-      </w:r>
-      <w:r>
-        <w:rPr>
-          <w:color w:val="0D1B2A"/>
-        </w:rPr>
-        <w:t>Focal</w:t>
-      </w:r>
-      <w:proofErr w:type="spellEnd"/>
-      <w:r>
-        <w:rPr>
-          <w:color w:val="0D1B2A"/>
-        </w:rPr>
-        <w:t xml:space="preserve"> for Education:</w:t>
+        <w:t xml:space="preserve"> School district licensing with teacher dashboards, reading progress tracking, and IEP integration</w:t>
+      </w:r>
+      <w:r>
+        <w:rPr>
+          <w:color w:val="0D1B2A"/>
+        </w:rPr>
+        <w:t>Focal for Education:</w:t>
       </w:r>
     </w:p>
     <w:p>
@@ -7428,29 +6590,13 @@
           <w:bCs/>
           <w:color w:val="0D1B2A"/>
         </w:rPr>
-        <w:t xml:space="preserve"> Workplace accessibility compliance tooling; LMS and knowledge management platform </w:t>
-      </w:r>
-      <w:proofErr w:type="spellStart"/>
-      <w:r>
-        <w:rPr>
-          <w:b/>
-          <w:bCs/>
-          <w:color w:val="0D1B2A"/>
-        </w:rPr>
-        <w:t>integrations</w:t>
-      </w:r>
-      <w:r>
-        <w:rPr>
-          <w:color w:val="0D1B2A"/>
-        </w:rPr>
-        <w:t>Focal</w:t>
-      </w:r>
-      <w:proofErr w:type="spellEnd"/>
-      <w:r>
-        <w:rPr>
-          <w:color w:val="0D1B2A"/>
-        </w:rPr>
-        <w:t xml:space="preserve"> for Enterprise:</w:t>
+        <w:t xml:space="preserve"> Workplace accessibility compliance tooling; LMS and knowledge management platform integrations</w:t>
+      </w:r>
+      <w:r>
+        <w:rPr>
+          <w:color w:val="0D1B2A"/>
+        </w:rPr>
+        <w:t>Focal for Enterprise:</w:t>
       </w:r>
     </w:p>
     <w:p>
@@ -7468,29 +6614,13 @@
           <w:bCs/>
           <w:color w:val="0D1B2A"/>
         </w:rPr>
-        <w:t xml:space="preserve"> RSVP rendering as a service for publishers, e-reading platforms, and content delivery </w:t>
-      </w:r>
-      <w:proofErr w:type="spellStart"/>
-      <w:r>
-        <w:rPr>
-          <w:b/>
-          <w:bCs/>
-          <w:color w:val="0D1B2A"/>
-        </w:rPr>
-        <w:t>networks</w:t>
-      </w:r>
-      <w:r>
-        <w:rPr>
-          <w:color w:val="0D1B2A"/>
-        </w:rPr>
-        <w:t>API</w:t>
-      </w:r>
-      <w:proofErr w:type="spellEnd"/>
-      <w:r>
-        <w:rPr>
-          <w:color w:val="0D1B2A"/>
-        </w:rPr>
-        <w:t xml:space="preserve"> Access:</w:t>
+        <w:t xml:space="preserve"> RSVP rendering as a service for publishers, e-reading platforms, and content delivery networks</w:t>
+      </w:r>
+      <w:r>
+        <w:rPr>
+          <w:color w:val="0D1B2A"/>
+        </w:rPr>
+        <w:t>API Access:</w:t>
       </w:r>
     </w:p>
     <w:p>
@@ -7508,29 +6638,13 @@
           <w:bCs/>
           <w:color w:val="0D1B2A"/>
         </w:rPr>
-        <w:t xml:space="preserve"> Integration licensing with accessibility-mandated platforms in government, healthcare, and </w:t>
-      </w:r>
-      <w:proofErr w:type="spellStart"/>
-      <w:r>
-        <w:rPr>
-          <w:b/>
-          <w:bCs/>
-          <w:color w:val="0D1B2A"/>
-        </w:rPr>
-        <w:t>education</w:t>
-      </w:r>
-      <w:r>
-        <w:rPr>
-          <w:color w:val="0D1B2A"/>
-        </w:rPr>
-        <w:t>Partnerships</w:t>
-      </w:r>
-      <w:proofErr w:type="spellEnd"/>
-      <w:r>
-        <w:rPr>
-          <w:color w:val="0D1B2A"/>
-        </w:rPr>
-        <w:t>:</w:t>
+        <w:t xml:space="preserve"> Integration licensing with accessibility-mandated platforms in government, healthcare, and education</w:t>
+      </w:r>
+      <w:r>
+        <w:rPr>
+          <w:color w:val="0D1B2A"/>
+        </w:rPr>
+        <w:t>Partnerships:</w:t>
       </w:r>
     </w:p>
     <w:p/>
@@ -7556,12 +6670,6 @@
         <w:gridCol w:w="7920"/>
       </w:tblGrid>
       <w:tr>
-        <w:tblPrEx>
-          <w:tblCellMar>
-            <w:top w:w="0" w:type="dxa"/>
-            <w:bottom w:w="0" w:type="dxa"/>
-          </w:tblCellMar>
-        </w:tblPrEx>
         <w:tc>
           <w:tcPr>
             <w:tcW w:w="1440" w:type="dxa"/>
@@ -7618,35 +6726,7 @@
               <w:rPr>
                 <w:color w:val="0D1B2A"/>
               </w:rPr>
-              <w:t xml:space="preserve">Free at the base. Institutional and enterprise revenue above. The people who need it </w:t>
-            </w:r>
-            <w:proofErr w:type="gramStart"/>
-            <w:r>
-              <w:rPr>
-                <w:color w:val="0D1B2A"/>
-              </w:rPr>
-              <w:t>most</w:t>
-            </w:r>
-            <w:proofErr w:type="gramEnd"/>
-            <w:r>
-              <w:rPr>
-                <w:color w:val="0D1B2A"/>
-              </w:rPr>
-              <w:t xml:space="preserve"> pay nothing. The </w:t>
-            </w:r>
-            <w:proofErr w:type="spellStart"/>
-            <w:r>
-              <w:rPr>
-                <w:color w:val="0D1B2A"/>
-              </w:rPr>
-              <w:t>organisations</w:t>
-            </w:r>
-            <w:proofErr w:type="spellEnd"/>
-            <w:r>
-              <w:rPr>
-                <w:color w:val="0D1B2A"/>
-              </w:rPr>
-              <w:t xml:space="preserve"> that serve them do.</w:t>
+              <w:t>Free at the base. Institutional and enterprise revenue above. The people who need it most pay nothing. The organisations that serve them do.</w:t>
             </w:r>
           </w:p>
         </w:tc>
@@ -7719,7 +6799,6 @@
         <w:spacing w:before="60" w:after="160"/>
         <w:jc w:val="center"/>
       </w:pPr>
-      <w:proofErr w:type="gramStart"/>
       <w:r>
         <w:rPr>
           <w:b/>
@@ -7728,18 +6807,7 @@
           <w:sz w:val="36"/>
           <w:szCs w:val="36"/>
         </w:rPr>
-        <w:t>Focal  —</w:t>
-      </w:r>
-      <w:proofErr w:type="gramEnd"/>
-      <w:r>
-        <w:rPr>
-          <w:b/>
-          <w:bCs/>
-          <w:color w:val="1E3A5F"/>
-          <w:sz w:val="36"/>
-          <w:szCs w:val="36"/>
-        </w:rPr>
-        <w:t xml:space="preserve">  Reading Without Barriers</w:t>
+        <w:t>Focal  —  Reading Without Barriers</w:t>
       </w:r>
     </w:p>
     <w:p/>
@@ -7817,21 +6885,7 @@
         <w:rPr>
           <w:color w:val="0D1B2A"/>
         </w:rPr>
-        <w:t xml:space="preserve">Distribution: School district and enterprise sales; accessibility </w:t>
-      </w:r>
-      <w:proofErr w:type="spellStart"/>
-      <w:r>
-        <w:rPr>
-          <w:color w:val="0D1B2A"/>
-        </w:rPr>
-        <w:t>organisation</w:t>
-      </w:r>
-      <w:proofErr w:type="spellEnd"/>
-      <w:r>
-        <w:rPr>
-          <w:color w:val="0D1B2A"/>
-        </w:rPr>
-        <w:t xml:space="preserve"> partnerships</w:t>
+        <w:t>Distribution: School district and enterprise sales; accessibility organisation partnerships</w:t>
       </w:r>
     </w:p>
     <w:p>
@@ -7873,12 +6927,6 @@
         <w:gridCol w:w="7920"/>
       </w:tblGrid>
       <w:tr>
-        <w:tblPrEx>
-          <w:tblCellMar>
-            <w:top w:w="0" w:type="dxa"/>
-            <w:bottom w:w="0" w:type="dxa"/>
-          </w:tblCellMar>
-        </w:tblPrEx>
         <w:tc>
           <w:tcPr>
             <w:tcW w:w="1440" w:type="dxa"/>
@@ -7931,56 +6979,18 @@
             </w:tcMar>
           </w:tcPr>
           <w:p>
-            <w:proofErr w:type="gramStart"/>
-            <w:r>
-              <w:rPr>
-                <w:color w:val="0D1B2A"/>
-              </w:rPr>
-              <w:t>info@diatasso.net</w:t>
-            </w:r>
-            <w:r>
-              <w:rPr>
-                <w:color w:val="0D1B2A"/>
-              </w:rPr>
-              <w:t xml:space="preserve">  •</w:t>
-            </w:r>
-            <w:proofErr w:type="gramEnd"/>
-            <w:r>
-              <w:rPr>
-                <w:color w:val="0D1B2A"/>
-              </w:rPr>
-              <w:t xml:space="preserve">  </w:t>
-            </w:r>
-            <w:proofErr w:type="spellStart"/>
-            <w:proofErr w:type="gramStart"/>
-            <w:r>
-              <w:rPr>
-                <w:color w:val="0D1B2A"/>
-              </w:rPr>
-              <w:t>focal.app</w:t>
-            </w:r>
-            <w:proofErr w:type="spellEnd"/>
-            <w:r>
-              <w:rPr>
-                <w:color w:val="0D1B2A"/>
-              </w:rPr>
-              <w:t xml:space="preserve">  •</w:t>
-            </w:r>
-            <w:proofErr w:type="gramEnd"/>
-            <w:r>
-              <w:rPr>
-                <w:color w:val="0D1B2A"/>
-              </w:rPr>
-              <w:t xml:space="preserve">  github.com/</w:t>
-            </w:r>
-            <w:proofErr w:type="gramStart"/>
-            <w:r>
-              <w:rPr>
-                <w:color w:val="0D1B2A"/>
-              </w:rPr>
-              <w:t>focal-app</w:t>
-            </w:r>
-            <w:proofErr w:type="gramEnd"/>
+            <w:r>
+              <w:rPr>
+                <w:color w:val="0D1B2A"/>
+              </w:rPr>
+              <w:t xml:space="preserve">info@diatasso.net  •  </w:t>
+            </w:r>
+            <w:r>
+              <w:rPr>
+                <w:color w:val="0D1B2A"/>
+              </w:rPr>
+              <w:t>https://focal-reader.netlify.app/</w:t>
+            </w:r>
           </w:p>
         </w:tc>
       </w:tr>
@@ -8003,8 +7013,8 @@
       </w:r>
     </w:p>
     <w:sectPr>
-      <w:headerReference w:type="default" r:id="rId7"/>
-      <w:footerReference w:type="default" r:id="rId8"/>
+      <w:headerReference w:type="default" r:id="rId9"/>
+      <w:footerReference w:type="default" r:id="rId10"/>
       <w:pgSz w:w="12240" w:h="15840"/>
       <w:pgMar w:top="1440" w:right="1440" w:bottom="1440" w:left="1440" w:header="708" w:footer="708" w:gutter="0"/>
       <w:cols w:space="720"/>
@@ -8098,35 +7108,7 @@
         <w:sz w:val="17"/>
         <w:szCs w:val="17"/>
       </w:rPr>
-      <w:t xml:space="preserve">  •  </w:t>
-    </w:r>
-    <w:proofErr w:type="spellStart"/>
-    <w:proofErr w:type="gramStart"/>
-    <w:r>
-      <w:rPr>
-        <w:color w:val="4A5568"/>
-        <w:sz w:val="17"/>
-        <w:szCs w:val="17"/>
-      </w:rPr>
-      <w:t>focal.app</w:t>
-    </w:r>
-    <w:proofErr w:type="spellEnd"/>
-    <w:r>
-      <w:rPr>
-        <w:color w:val="4A5568"/>
-        <w:sz w:val="17"/>
-        <w:szCs w:val="17"/>
-      </w:rPr>
-      <w:t xml:space="preserve">  •</w:t>
-    </w:r>
-    <w:proofErr w:type="gramEnd"/>
-    <w:r>
-      <w:rPr>
-        <w:color w:val="4A5568"/>
-        <w:sz w:val="17"/>
-        <w:szCs w:val="17"/>
-      </w:rPr>
-      <w:t xml:space="preserve">  © 202</w:t>
+      <w:t xml:space="preserve">  •  focal.app  •  © 202</w:t>
     </w:r>
     <w:r>
       <w:rPr>
@@ -8176,41 +7158,13 @@
       </w:pBdr>
       <w:spacing w:after="100"/>
     </w:pPr>
-    <w:proofErr w:type="gramStart"/>
     <w:r>
       <w:rPr>
         <w:color w:val="4A5568"/>
         <w:sz w:val="17"/>
         <w:szCs w:val="17"/>
       </w:rPr>
-      <w:t>Focal  •</w:t>
-    </w:r>
-    <w:proofErr w:type="gramEnd"/>
-    <w:r>
-      <w:rPr>
-        <w:color w:val="4A5568"/>
-        <w:sz w:val="17"/>
-        <w:szCs w:val="17"/>
-      </w:rPr>
-      <w:t xml:space="preserve">  Investor </w:t>
-    </w:r>
-    <w:proofErr w:type="gramStart"/>
-    <w:r>
-      <w:rPr>
-        <w:color w:val="4A5568"/>
-        <w:sz w:val="17"/>
-        <w:szCs w:val="17"/>
-      </w:rPr>
-      <w:t>Brief  •</w:t>
-    </w:r>
-    <w:proofErr w:type="gramEnd"/>
-    <w:r>
-      <w:rPr>
-        <w:color w:val="4A5568"/>
-        <w:sz w:val="17"/>
-        <w:szCs w:val="17"/>
-      </w:rPr>
-      <w:t xml:space="preserve">  Confidential</w:t>
+      <w:t>Focal  •  Investor Brief  •  Confidential</w:t>
     </w:r>
   </w:p>
 </w:hdr>
@@ -8916,7 +7870,6 @@
   <w:style w:type="character" w:default="1" w:styleId="DefaultParagraphFont">
     <w:name w:val="Default Paragraph Font"/>
     <w:uiPriority w:val="1"/>
-    <w:semiHidden/>
     <w:unhideWhenUsed/>
   </w:style>
   <w:style w:type="table" w:default="1" w:styleId="TableNormal">
@@ -9073,6 +8026,18 @@
     <w:link w:val="Footer"/>
     <w:uiPriority w:val="99"/>
     <w:rsid w:val="00821DDD"/>
+  </w:style>
+  <w:style w:type="character" w:styleId="UnresolvedMention">
+    <w:name w:val="Unresolved Mention"/>
+    <w:basedOn w:val="DefaultParagraphFont"/>
+    <w:uiPriority w:val="99"/>
+    <w:semiHidden/>
+    <w:unhideWhenUsed/>
+    <w:rsid w:val="0022714A"/>
+    <w:rPr>
+      <w:color w:val="605E5C"/>
+      <w:shd w:val="clear" w:color="auto" w:fill="E1DFDD"/>
+    </w:rPr>
   </w:style>
 </w:styles>
 </file>

</xml_diff>

<commit_message>
Update investor brief with four new feature additions
- Accessibility Layer: expanded OpenDyslexic bullet to cover both clinically-designed
  fonts — OpenDyslexic and Atkinson Hyperlegible — with clinical rationale for each
- Core Reading Engine: added Reading Display Mode (Auto) bullet
- Engagement & Retention: added Structured onboarding, Guided feature tour, and
  Contextual tooltips bullets
- Business Model: fixed broken label-last formatting → Focal Pro / Focal for Education /
  Focal for Enterprise / API Access / Partnerships now display correctly
- PDF regenerated via Microsoft Word for full fidelity (307KB, was 260KB)

Co-Authored-By: Claude Sonnet 4.6 <noreply@anthropic.com>
</commit_message>
<xml_diff>
--- a/Focal-Investor-Brief.docx
+++ b/Focal-Investor-Brief.docx
@@ -5583,9 +5583,12 @@
       </w:pPr>
       <w:r>
         <w:rPr>
-          <w:color w:val="0D1B2A"/>
-        </w:rPr>
-        <w:t>Full progress scrubbing and word-level navigation</w:t>
+          <w:b/>
+        </w:rPr>
+        <w:t>Reading Display Mode</w:t>
+      </w:r>
+      <w:r>
+        <w:t xml:space="preserve"> — typography adapts to cognitive goal: Scan (light Inter, open spacing) for high-WPM skimming, Deep (bold Georgia serif) for comprehension, Auto switches in real-time based on WPM</w:t>
       </w:r>
     </w:p>
     <w:p>
@@ -5601,7 +5604,7 @@
         <w:rPr>
           <w:color w:val="0D1B2A"/>
         </w:rPr>
-        <w:t>Sentence context view with click-to-seek on any word</w:t>
+        <w:t>Full progress scrubbing and word-level navigation</w:t>
       </w:r>
     </w:p>
     <w:p>
@@ -5617,16 +5620,7 @@
         <w:rPr>
           <w:color w:val="0D1B2A"/>
         </w:rPr>
-        <w:t>Multi-language ORP: Latin, Cyrillic, CJK, Arabic, Devanagari</w:t>
-      </w:r>
-    </w:p>
-    <w:p/>
-    <w:p>
-      <w:pPr>
-        <w:pStyle w:val="Heading3"/>
-      </w:pPr>
-      <w:r>
-        <w:t>Accessibility Layer</w:t>
+        <w:t>Sentence context view with click-to-seek on any word</w:t>
       </w:r>
     </w:p>
     <w:p>
@@ -5642,7 +5636,16 @@
         <w:rPr>
           <w:color w:val="0D1B2A"/>
         </w:rPr>
-        <w:t>OpenDyslexic font toggle</w:t>
+        <w:t>Multi-language ORP: Latin, Cyrillic, CJK, Arabic, Devanagari</w:t>
+      </w:r>
+    </w:p>
+    <w:p/>
+    <w:p>
+      <w:pPr>
+        <w:pStyle w:val="Heading3"/>
+      </w:pPr>
+      <w:r>
+        <w:t>Accessibility Layer</w:t>
       </w:r>
     </w:p>
     <w:p>
@@ -5655,10 +5658,25 @@
         <w:spacing w:before="40" w:after="80"/>
       </w:pPr>
       <w:r>
-        <w:rPr>
-          <w:color w:val="0D1B2A"/>
-        </w:rPr>
-        <w:t>Full 2D hue × saturation background palette with depth and temperature control</w:t>
+        <w:t xml:space="preserve">Two clinically-designed accessible fonts: </w:t>
+      </w:r>
+      <w:r>
+        <w:rPr>
+          <w:b/>
+        </w:rPr>
+        <w:t>OpenDyslexic</w:t>
+      </w:r>
+      <w:r>
+        <w:t xml:space="preserve"> (weighted letter bottoms prevent b/d/p/q reversal) and </w:t>
+      </w:r>
+      <w:r>
+        <w:rPr>
+          <w:b/>
+        </w:rPr>
+        <w:t>Atkinson Hyperlegible</w:t>
+      </w:r>
+      <w:r>
+        <w:t xml:space="preserve"> (maximised inter-character differentiation for low vision) — one-click toggle</w:t>
       </w:r>
     </w:p>
     <w:p>
@@ -5674,7 +5692,7 @@
         <w:rPr>
           <w:color w:val="0D1B2A"/>
         </w:rPr>
-        <w:t>High contrast mode and adjustable font size</w:t>
+        <w:t>Full 2D hue × saturation background palette with depth and temperature control</w:t>
       </w:r>
     </w:p>
     <w:p>
@@ -5690,7 +5708,7 @@
         <w:rPr>
           <w:color w:val="0D1B2A"/>
         </w:rPr>
-        <w:t>Dark / light themes with per-theme colour inheritance</w:t>
+        <w:t>High contrast mode and adjustable font size</w:t>
       </w:r>
     </w:p>
     <w:p>
@@ -5706,7 +5724,7 @@
         <w:rPr>
           <w:color w:val="0D1B2A"/>
         </w:rPr>
-        <w:t>Accent colour customisation with colour-blind-friendly presets</w:t>
+        <w:t>Dark / light themes with per-theme colour inheritance</w:t>
       </w:r>
     </w:p>
     <w:p>
@@ -5722,7 +5740,7 @@
         <w:rPr>
           <w:color w:val="0D1B2A"/>
         </w:rPr>
-        <w:t>prefers-reduced-motion: all animations suppressed at OS level when requested</w:t>
+        <w:t>Accent colour customisation with colour-blind-friendly presets</w:t>
       </w:r>
     </w:p>
     <w:p>
@@ -5738,16 +5756,7 @@
         <w:rPr>
           <w:color w:val="0D1B2A"/>
         </w:rPr>
-        <w:t>Full ARIA labelling, aria-live word announcement, keyboard-only and touch navigation</w:t>
-      </w:r>
-    </w:p>
-    <w:p/>
-    <w:p>
-      <w:pPr>
-        <w:pStyle w:val="Heading3"/>
-      </w:pPr>
-      <w:r>
-        <w:t>Intelligence Layer</w:t>
+        <w:t>prefers-reduced-motion: all animations suppressed at OS level when requested</w:t>
       </w:r>
     </w:p>
     <w:p>
@@ -5763,7 +5772,16 @@
         <w:rPr>
           <w:color w:val="0D1B2A"/>
         </w:rPr>
-        <w:t>AI analysis powered by Groq (Llama 3.3 70B) — ultra-low latency inference</w:t>
+        <w:t>Full ARIA labelling, aria-live word announcement, keyboard-only and touch navigation</w:t>
+      </w:r>
+    </w:p>
+    <w:p/>
+    <w:p>
+      <w:pPr>
+        <w:pStyle w:val="Heading3"/>
+      </w:pPr>
+      <w:r>
+        <w:t>Intelligence Layer</w:t>
       </w:r>
     </w:p>
     <w:p>
@@ -5779,7 +5797,7 @@
         <w:rPr>
           <w:color w:val="0D1B2A"/>
         </w:rPr>
-        <w:t>Interactive quizzes: multiple-choice, true/false, fill-in-the-blank — AI-generated, auto-graded, scores tracked per text</w:t>
+        <w:t>AI analysis powered by Groq (Llama 3.3 70B) — ultra-low latency inference</w:t>
       </w:r>
     </w:p>
     <w:p>
@@ -5795,7 +5813,7 @@
         <w:rPr>
           <w:color w:val="0D1B2A"/>
         </w:rPr>
-        <w:t>Summarise, Key Points, Explain Simply, Reading Level, Comprehension Check</w:t>
+        <w:t>Interactive quizzes: multiple-choice, true/false, fill-in-the-blank — AI-generated, auto-graded, scores tracked per text</w:t>
       </w:r>
     </w:p>
     <w:p>
@@ -5811,7 +5829,7 @@
         <w:rPr>
           <w:color w:val="0D1B2A"/>
         </w:rPr>
-        <w:t>AI Psychometric Insights: clinical-quality analysis referencing Hasbrouck &amp; Tindal norms and DIBELS framework</w:t>
+        <w:t>Summarise, Key Points, Explain Simply, Reading Level, Comprehension Check</w:t>
       </w:r>
     </w:p>
     <w:p>
@@ -5827,16 +5845,7 @@
         <w:rPr>
           <w:color w:val="0D1B2A"/>
         </w:rPr>
-        <w:t>Import from TXT, PDF (PDF.js), EPUB (JSZip), DOCX (Mammoth.js), Markdown, RTF, HTML, CSV, and URL fetch</w:t>
-      </w:r>
-    </w:p>
-    <w:p/>
-    <w:p>
-      <w:pPr>
-        <w:pStyle w:val="Heading3"/>
-      </w:pPr>
-      <w:r>
-        <w:t>Psychometric Diagnostics</w:t>
+        <w:t>AI Psychometric Insights: clinical-quality analysis referencing Hasbrouck &amp; Tindal norms and DIBELS framework</w:t>
       </w:r>
     </w:p>
     <w:p>
@@ -5852,7 +5861,16 @@
         <w:rPr>
           <w:color w:val="0D1B2A"/>
         </w:rPr>
-        <w:t>Consistency (CV%): WPM coefficient of variation — flags attention and decoding issues</w:t>
+        <w:t>Import from TXT, PDF (PDF.js), EPUB (JSZip), DOCX (Mammoth.js), Markdown, RTF, HTML, CSV, and URL fetch</w:t>
+      </w:r>
+    </w:p>
+    <w:p/>
+    <w:p>
+      <w:pPr>
+        <w:pStyle w:val="Heading3"/>
+      </w:pPr>
+      <w:r>
+        <w:t>Psychometric Diagnostics</w:t>
       </w:r>
     </w:p>
     <w:p>
@@ -5868,7 +5886,7 @@
         <w:rPr>
           <w:color w:val="0D1B2A"/>
         </w:rPr>
-        <w:t>Avg Focus: sustained attention span measured between play and pause events</w:t>
+        <w:t>Consistency (CV%): WPM coefficient of variation — flags attention and decoding issues</w:t>
       </w:r>
     </w:p>
     <w:p>
@@ -5884,7 +5902,7 @@
         <w:rPr>
           <w:color w:val="0D1B2A"/>
         </w:rPr>
-        <w:t>Regressions: backward navigation rate per 1,000 words — comprehension difficulty indicator</w:t>
+        <w:t>Avg Focus: sustained attention span measured between play and pause events</w:t>
       </w:r>
     </w:p>
     <w:p>
@@ -5900,7 +5918,7 @@
         <w:rPr>
           <w:color w:val="0D1B2A"/>
         </w:rPr>
-        <w:t>Stamina: WPM decline ratio within sessions — measures reading fatigue</w:t>
+        <w:t>Regressions: backward navigation rate per 1,000 words — comprehension difficulty indicator</w:t>
       </w:r>
     </w:p>
     <w:p>
@@ -5916,7 +5934,7 @@
         <w:rPr>
           <w:color w:val="0D1B2A"/>
         </w:rPr>
-        <w:t>Comprehension: average score across graded interactive quizzes</w:t>
+        <w:t>Stamina: WPM decline ratio within sessions — measures reading fatigue</w:t>
       </w:r>
     </w:p>
     <w:p>
@@ -5932,16 +5950,7 @@
         <w:rPr>
           <w:color w:val="0D1B2A"/>
         </w:rPr>
-        <w:t>Effective WPM: speed × comprehension — the gold-standard composite measure</w:t>
-      </w:r>
-    </w:p>
-    <w:p/>
-    <w:p>
-      <w:pPr>
-        <w:pStyle w:val="Heading3"/>
-      </w:pPr>
-      <w:r>
-        <w:t>Engagement &amp; Retention</w:t>
+        <w:t>Comprehension: average score across graded interactive quizzes</w:t>
       </w:r>
     </w:p>
     <w:p>
@@ -5957,7 +5966,16 @@
         <w:rPr>
           <w:color w:val="0D1B2A"/>
         </w:rPr>
-        <w:t>Gamification: daily streak, configurable reading goal (5–60 min), milestone badges (100 → 250K words)</w:t>
+        <w:t>Effective WPM: speed × comprehension — the gold-standard composite measure</w:t>
+      </w:r>
+    </w:p>
+    <w:p/>
+    <w:p>
+      <w:pPr>
+        <w:pStyle w:val="Heading3"/>
+      </w:pPr>
+      <w:r>
+        <w:t>Engagement &amp; Retention</w:t>
       </w:r>
     </w:p>
     <w:p>
@@ -5973,7 +5991,7 @@
         <w:rPr>
           <w:color w:val="0D1B2A"/>
         </w:rPr>
-        <w:t>Three-tab interface: Read (sacred reading surface), Learn (testing + analysis), Stats (psychometric dashboard)</w:t>
+        <w:t>Gamification: daily streak, configurable reading goal (5–60 min), milestone badges (100 → 250K words)</w:t>
       </w:r>
     </w:p>
     <w:p>
@@ -5989,7 +6007,7 @@
         <w:rPr>
           <w:color w:val="0D1B2A"/>
         </w:rPr>
-        <w:t>Zen mode: distraction-free reading with faded controls, activated by keystroke</w:t>
+        <w:t>Three-tab interface: Read (sacred reading surface), Learn (testing + analysis), Stats (psychometric dashboard)</w:t>
       </w:r>
     </w:p>
     <w:p>
@@ -6005,7 +6023,7 @@
         <w:rPr>
           <w:color w:val="0D1B2A"/>
         </w:rPr>
-        <w:t>Focus Timer in header: full Pomodoro with rounds, long breaks, auto-start, progress ring</w:t>
+        <w:t>Zen mode: distraction-free reading with faded controls, activated by keystroke</w:t>
       </w:r>
     </w:p>
     <w:p>
@@ -6021,7 +6039,80 @@
         <w:rPr>
           <w:color w:val="0D1B2A"/>
         </w:rPr>
+        <w:t>Focus Timer in header: full Pomodoro with rounds, long breaks, auto-start, progress ring</w:t>
+      </w:r>
+    </w:p>
+    <w:p>
+      <w:pPr>
+        <w:pStyle w:val="ListParagraph"/>
+        <w:numPr>
+          <w:ilvl w:val="0"/>
+          <w:numId w:val="2"/>
+        </w:numPr>
+        <w:spacing w:before="40" w:after="80"/>
+      </w:pPr>
+      <w:r>
+        <w:rPr>
+          <w:color w:val="0D1B2A"/>
+        </w:rPr>
         <w:t>Session persistence: loaded text, position, and timer state survive page refresh — zero data loss</w:t>
+      </w:r>
+    </w:p>
+    <w:p>
+      <w:pPr>
+        <w:pStyle w:val="ListParagraph"/>
+        <w:numPr>
+          <w:ilvl w:val="0"/>
+          <w:numId w:val="2"/>
+        </w:numPr>
+        <w:spacing w:before="40" w:after="80"/>
+      </w:pPr>
+      <w:r>
+        <w:rPr>
+          <w:b/>
+        </w:rPr>
+        <w:t>Structured onboarding</w:t>
+      </w:r>
+      <w:r>
+        <w:t xml:space="preserve"> — first-run 14-day training ramp (200 → 250 → 300+ WPM) with progress bar, calibration session, and daily training day counter grounded in RSVP adaptation research</w:t>
+      </w:r>
+    </w:p>
+    <w:p>
+      <w:pPr>
+        <w:pStyle w:val="ListParagraph"/>
+        <w:numPr>
+          <w:ilvl w:val="0"/>
+          <w:numId w:val="2"/>
+        </w:numPr>
+        <w:spacing w:before="40" w:after="80"/>
+      </w:pPr>
+      <w:r>
+        <w:rPr>
+          <w:b/>
+        </w:rPr>
+        <w:t>Guided feature tour</w:t>
+      </w:r>
+      <w:r>
+        <w:t xml:space="preserve"> — 6-step spotlight walkthrough on first launch highlights every key surface with a glowing focus ring and contextual popover; state persisted locally</w:t>
+      </w:r>
+    </w:p>
+    <w:p>
+      <w:pPr>
+        <w:pStyle w:val="ListParagraph"/>
+        <w:numPr>
+          <w:ilvl w:val="0"/>
+          <w:numId w:val="2"/>
+        </w:numPr>
+        <w:spacing w:before="40" w:after="80"/>
+      </w:pPr>
+      <w:r>
+        <w:rPr>
+          <w:b/>
+        </w:rPr>
+        <w:t>Contextual tooltips</w:t>
+      </w:r>
+      <w:r>
+        <w:t xml:space="preserve"> — every setting carries an inline explanation covering what it does, the science behind it, and when to use it; zero documentation required</w:t>
       </w:r>
     </w:p>
     <w:p>
@@ -6539,16 +6630,11 @@
       <w:r>
         <w:rPr>
           <w:b/>
-          <w:bCs/>
-          <w:color w:val="0D1B2A"/>
-        </w:rPr>
-        <w:t xml:space="preserve"> Premium tier — advanced AI features, team libraries, cross-device sync</w:t>
-      </w:r>
-      <w:r>
-        <w:rPr>
-          <w:color w:val="0D1B2A"/>
-        </w:rPr>
-        <w:t>Focal Pro:</w:t>
+        </w:rPr>
+        <w:t xml:space="preserve">Focal Pro: </w:t>
+      </w:r>
+      <w:r>
+        <w:t>Premium tier — advanced AI features, team libraries, cross-device sync</w:t>
       </w:r>
     </w:p>
     <w:p>
@@ -6563,16 +6649,11 @@
       <w:r>
         <w:rPr>
           <w:b/>
-          <w:bCs/>
-          <w:color w:val="0D1B2A"/>
-        </w:rPr>
-        <w:t xml:space="preserve"> School district licensing with teacher dashboards, reading progress tracking, and IEP integration</w:t>
-      </w:r>
-      <w:r>
-        <w:rPr>
-          <w:color w:val="0D1B2A"/>
-        </w:rPr>
-        <w:t>Focal for Education:</w:t>
+        </w:rPr>
+        <w:t xml:space="preserve">Focal for Education: </w:t>
+      </w:r>
+      <w:r>
+        <w:t>School district licensing with teacher dashboards, reading progress tracking, and IEP integration</w:t>
       </w:r>
     </w:p>
     <w:p>
@@ -6587,16 +6668,11 @@
       <w:r>
         <w:rPr>
           <w:b/>
-          <w:bCs/>
-          <w:color w:val="0D1B2A"/>
-        </w:rPr>
-        <w:t xml:space="preserve"> Workplace accessibility compliance tooling; LMS and knowledge management platform integrations</w:t>
-      </w:r>
-      <w:r>
-        <w:rPr>
-          <w:color w:val="0D1B2A"/>
-        </w:rPr>
-        <w:t>Focal for Enterprise:</w:t>
+        </w:rPr>
+        <w:t xml:space="preserve">Focal for Enterprise: </w:t>
+      </w:r>
+      <w:r>
+        <w:t>Workplace accessibility compliance tooling; LMS and knowledge management platform integrations</w:t>
       </w:r>
     </w:p>
     <w:p>
@@ -6611,16 +6687,11 @@
       <w:r>
         <w:rPr>
           <w:b/>
-          <w:bCs/>
-          <w:color w:val="0D1B2A"/>
-        </w:rPr>
-        <w:t xml:space="preserve"> RSVP rendering as a service for publishers, e-reading platforms, and content delivery networks</w:t>
-      </w:r>
-      <w:r>
-        <w:rPr>
-          <w:color w:val="0D1B2A"/>
-        </w:rPr>
-        <w:t>API Access:</w:t>
+        </w:rPr>
+        <w:t xml:space="preserve">API Access: </w:t>
+      </w:r>
+      <w:r>
+        <w:t>RSVP rendering as a service for publishers, e-reading platforms, and content delivery networks</w:t>
       </w:r>
     </w:p>
     <w:p>
@@ -6635,16 +6706,11 @@
       <w:r>
         <w:rPr>
           <w:b/>
-          <w:bCs/>
-          <w:color w:val="0D1B2A"/>
-        </w:rPr>
-        <w:t xml:space="preserve"> Integration licensing with accessibility-mandated platforms in government, healthcare, and education</w:t>
-      </w:r>
-      <w:r>
-        <w:rPr>
-          <w:color w:val="0D1B2A"/>
-        </w:rPr>
-        <w:t>Partnerships:</w:t>
+        </w:rPr>
+        <w:t xml:space="preserve">Partnerships: </w:t>
+      </w:r>
+      <w:r>
+        <w:t>Integration licensing with accessibility-mandated platforms in government, healthcare, and education</w:t>
       </w:r>
     </w:p>
     <w:p/>

</xml_diff>

<commit_message>
Recommit investor brief — correct PDF path and Word-finalized docx
PDF regenerated by Word to the correct repo path (308KB).
Docx reflects Word's final save after PDF export.

Co-Authored-By: Claude Sonnet 4.6 <noreply@anthropic.com>
</commit_message>
<xml_diff>
--- a/Focal-Investor-Brief.docx
+++ b/Focal-Investor-Brief.docx
@@ -134,7 +134,7 @@
           <w:sz w:val="24"/>
           <w:szCs w:val="24"/>
         </w:rPr>
-        <w:t>Investor Brief  •  202</w:t>
+        <w:t xml:space="preserve">Investor </w:t>
       </w:r>
       <w:r>
         <w:rPr>
@@ -142,7 +142,15 @@
           <w:sz w:val="24"/>
           <w:szCs w:val="24"/>
         </w:rPr>
-        <w:t>6</w:t>
+        <w:t xml:space="preserve">Brief </w:t>
+      </w:r>
+      <w:r>
+        <w:rPr>
+          <w:color w:val="4A5568"/>
+          <w:sz w:val="24"/>
+          <w:szCs w:val="24"/>
+        </w:rPr>
+        <w:t>• 2026</w:t>
       </w:r>
     </w:p>
     <w:p/>
@@ -179,7 +187,23 @@
           <w:iCs/>
           <w:color w:val="0D1B2A"/>
         </w:rPr>
-        <w:t>built for people with reading disabilities — and used by everyone.</w:t>
+        <w:t xml:space="preserve">built for people with reading disabilities </w:t>
+      </w:r>
+      <w:r>
+        <w:rPr>
+          <w:i/>
+          <w:iCs/>
+          <w:color w:val="0D1B2A"/>
+        </w:rPr>
+        <w:t>-</w:t>
+      </w:r>
+      <w:r>
+        <w:rPr>
+          <w:i/>
+          <w:iCs/>
+          <w:color w:val="0D1B2A"/>
+        </w:rPr>
+        <w:t xml:space="preserve"> and used by everyone.</w:t>
       </w:r>
     </w:p>
     <w:p/>
@@ -282,7 +306,19 @@
               <w:rPr>
                 <w:color w:val="0D1B2A"/>
               </w:rPr>
-              <w:t>To make reading accessible to everyone — starting with the people who need it most.</w:t>
+              <w:t xml:space="preserve">To make reading accessible to everyone </w:t>
+            </w:r>
+            <w:r>
+              <w:rPr>
+                <w:color w:val="0D1B2A"/>
+              </w:rPr>
+              <w:t>-</w:t>
+            </w:r>
+            <w:r>
+              <w:rPr>
+                <w:color w:val="0D1B2A"/>
+              </w:rPr>
+              <w:t xml:space="preserve"> starting with the people who need it most.</w:t>
             </w:r>
           </w:p>
         </w:tc>
@@ -297,7 +333,43 @@
         <w:rPr>
           <w:color w:val="0D1B2A"/>
         </w:rPr>
-        <w:t>One in five people has a reading disability. For hundreds of millions of people worldwide, the act of reading — the foundational skill on which education, employment, and civic life depend — is genuinely, neurologically difficult. Not because of lack of intelligence or effort. Because the format in which we deliver text was designed for people whose brains process it easily, and never reconsidered for those who do not.</w:t>
+        <w:t xml:space="preserve">One in five people has a reading disability. For hundreds of millions of people worldwide, the act of reading </w:t>
+      </w:r>
+      <w:r>
+        <w:rPr>
+          <w:color w:val="0D1B2A"/>
+        </w:rPr>
+        <w:t>-</w:t>
+      </w:r>
+      <w:r>
+        <w:rPr>
+          <w:color w:val="0D1B2A"/>
+        </w:rPr>
+        <w:t xml:space="preserve"> the foundational skill on which education, employment, and civic life depend </w:t>
+      </w:r>
+      <w:r>
+        <w:rPr>
+          <w:color w:val="0D1B2A"/>
+        </w:rPr>
+        <w:t>-</w:t>
+      </w:r>
+      <w:r>
+        <w:rPr>
+          <w:color w:val="0D1B2A"/>
+        </w:rPr>
+        <w:t xml:space="preserve"> is genuinely, neurologically difficult. Not because of lack of intelligence or effort. Because the format in which we deliver text was designed for people whose brains process it </w:t>
+      </w:r>
+      <w:r>
+        <w:rPr>
+          <w:color w:val="0D1B2A"/>
+        </w:rPr>
+        <w:t>easily and</w:t>
+      </w:r>
+      <w:r>
+        <w:rPr>
+          <w:color w:val="0D1B2A"/>
+        </w:rPr>
+        <w:t xml:space="preserve"> never reconsidered for those who do not.</w:t>
       </w:r>
     </w:p>
     <w:p>
@@ -308,7 +380,31 @@
         <w:rPr>
           <w:color w:val="0D1B2A"/>
         </w:rPr>
-        <w:t>Focal is a Rapid Serial Visual Presentation (RSVP) platform that changes the format. Rather than asking readers to scan a page — a process that requires precise saccadic eye movement, visual tracking, crowding-noise management, and phonological processing in parallel — Focal brings the text to the reader. One word. One place. One moment at a time.</w:t>
+        <w:t xml:space="preserve">Focal is a Rapid Serial Visual Presentation (RSVP) platform that changes the format. Rather than asking readers to scan a page </w:t>
+      </w:r>
+      <w:r>
+        <w:rPr>
+          <w:color w:val="0D1B2A"/>
+        </w:rPr>
+        <w:t>-</w:t>
+      </w:r>
+      <w:r>
+        <w:rPr>
+          <w:color w:val="0D1B2A"/>
+        </w:rPr>
+        <w:t xml:space="preserve"> a process that requires precise saccadic eye movement, visual tracking, crowding-noise management, and phonological processing in parallel </w:t>
+      </w:r>
+      <w:r>
+        <w:rPr>
+          <w:color w:val="0D1B2A"/>
+        </w:rPr>
+        <w:t>-</w:t>
+      </w:r>
+      <w:r>
+        <w:rPr>
+          <w:color w:val="0D1B2A"/>
+        </w:rPr>
+        <w:t xml:space="preserve"> Focal brings the text to the reader. One word. One place. One moment at a time.</w:t>
       </w:r>
     </w:p>
     <w:p>
@@ -319,7 +415,19 @@
         <w:rPr>
           <w:color w:val="0D1B2A"/>
         </w:rPr>
-        <w:t>Research by Forster (1970) and Potter (1984) demonstrated that RSVP allows processing rates of 700+ WPM for trained readers. With Focal’s Optimal Recognition Point alignment, intelligent adaptive pacing, and full accessibility toolkit, that potential is now available to everyone — especially those who need it most.</w:t>
+        <w:t xml:space="preserve">Research by Forster (1970) and Potter (1984) demonstrated that RSVP allows processing rates of 700+ WPM for trained readers. With Focal’s Optimal Recognition Point alignment, intelligent adaptive pacing, and full accessibility toolkit, that potential is now available to everyone </w:t>
+      </w:r>
+      <w:r>
+        <w:rPr>
+          <w:color w:val="0D1B2A"/>
+        </w:rPr>
+        <w:t>-</w:t>
+      </w:r>
+      <w:r>
+        <w:rPr>
+          <w:color w:val="0D1B2A"/>
+        </w:rPr>
+        <w:t xml:space="preserve"> especially those who need it most.</w:t>
       </w:r>
     </w:p>
     <w:p/>
@@ -512,7 +620,31 @@
                 <w:sz w:val="17"/>
                 <w:szCs w:val="17"/>
               </w:rPr>
-              <w:t>people has a reading disability</w:t>
+              <w:t>People</w:t>
+            </w:r>
+            <w:r>
+              <w:rPr>
+                <w:color w:val="4A5568"/>
+                <w:sz w:val="17"/>
+                <w:szCs w:val="17"/>
+              </w:rPr>
+              <w:t xml:space="preserve"> </w:t>
+            </w:r>
+            <w:r>
+              <w:rPr>
+                <w:color w:val="4A5568"/>
+                <w:sz w:val="17"/>
+                <w:szCs w:val="17"/>
+              </w:rPr>
+              <w:t>have</w:t>
+            </w:r>
+            <w:r>
+              <w:rPr>
+                <w:color w:val="4A5568"/>
+                <w:sz w:val="17"/>
+                <w:szCs w:val="17"/>
+              </w:rPr>
+              <w:t xml:space="preserve"> a reading disability</w:t>
             </w:r>
           </w:p>
         </w:tc>
@@ -654,7 +786,31 @@
         <w:rPr>
           <w:color w:val="0D1B2A"/>
         </w:rPr>
-        <w:t>Specific Learning Disabilities (SLDs) in reading — the clinical umbrella that includes dyslexia, visual processing disorders, processing speed deficits, and related conditions — are among the most prevalent and impactful cognitive differences in the world.</w:t>
+        <w:t xml:space="preserve">Specific Learning Disabilities (SLDs) in reading </w:t>
+      </w:r>
+      <w:r>
+        <w:rPr>
+          <w:color w:val="0D1B2A"/>
+        </w:rPr>
+        <w:t>-</w:t>
+      </w:r>
+      <w:r>
+        <w:rPr>
+          <w:color w:val="0D1B2A"/>
+        </w:rPr>
+        <w:t xml:space="preserve"> the clinical umbrella that includes dyslexia, visual processing disorders, processing speed deficits, and related conditions </w:t>
+      </w:r>
+      <w:r>
+        <w:rPr>
+          <w:color w:val="0D1B2A"/>
+        </w:rPr>
+        <w:t>-</w:t>
+      </w:r>
+      <w:r>
+        <w:rPr>
+          <w:color w:val="0D1B2A"/>
+        </w:rPr>
+        <w:t xml:space="preserve"> are among the most prevalent and impactful cognitive differences in the world.</w:t>
       </w:r>
     </w:p>
     <w:p>
@@ -765,7 +921,43 @@
         <w:rPr>
           <w:color w:val="0D1B2A"/>
         </w:rPr>
-        <w:t>Existing accommodations — text-to-speech, dyslexia fonts, screen magnification — reduce friction. They do not change the fundamental format. RSVP changes the format.</w:t>
+        <w:t xml:space="preserve">Existing </w:t>
+      </w:r>
+      <w:r>
+        <w:rPr>
+          <w:color w:val="0D1B2A"/>
+        </w:rPr>
+        <w:t>accommodation</w:t>
+      </w:r>
+      <w:r>
+        <w:rPr>
+          <w:color w:val="0D1B2A"/>
+        </w:rPr>
+        <w:t xml:space="preserve"> </w:t>
+      </w:r>
+      <w:r>
+        <w:rPr>
+          <w:color w:val="0D1B2A"/>
+        </w:rPr>
+        <w:t>-</w:t>
+      </w:r>
+      <w:r>
+        <w:rPr>
+          <w:color w:val="0D1B2A"/>
+        </w:rPr>
+        <w:t xml:space="preserve"> text-to-speech, dyslexia fonts, screen magnification </w:t>
+      </w:r>
+      <w:r>
+        <w:rPr>
+          <w:color w:val="0D1B2A"/>
+        </w:rPr>
+        <w:t>-</w:t>
+      </w:r>
+      <w:r>
+        <w:rPr>
+          <w:color w:val="0D1B2A"/>
+        </w:rPr>
+        <w:t xml:space="preserve"> reduce friction. They do not change the fundamental format. RSVP changes the format.</w:t>
       </w:r>
     </w:p>
     <w:p/>
@@ -847,7 +1039,19 @@
               <w:rPr>
                 <w:color w:val="0D1B2A"/>
               </w:rPr>
-              <w:t>The problem is not the reader. The problem is the format. A wall of text was never designed for 20% of the population — and the digital age has made text the surface on which everything happens.</w:t>
+              <w:t xml:space="preserve">The problem is not the reader. The problem is the format. A wall of text was never designed for 20% of the population </w:t>
+            </w:r>
+            <w:r>
+              <w:rPr>
+                <w:color w:val="0D1B2A"/>
+              </w:rPr>
+              <w:t>-</w:t>
+            </w:r>
+            <w:r>
+              <w:rPr>
+                <w:color w:val="0D1B2A"/>
+              </w:rPr>
+              <w:t xml:space="preserve"> and the digital age has made text the surface on which everything happens.</w:t>
             </w:r>
           </w:p>
         </w:tc>
@@ -885,7 +1089,13 @@
         <w:pStyle w:val="Heading2"/>
       </w:pPr>
       <w:r>
-        <w:t>How the Brain Reads — and Where It Breaks Down</w:t>
+        <w:t xml:space="preserve">How the Brain Reads </w:t>
+      </w:r>
+      <w:r>
+        <w:t>-</w:t>
+      </w:r>
+      <w:r>
+        <w:t xml:space="preserve"> and Where It Breaks Down</w:t>
       </w:r>
     </w:p>
     <w:p>
@@ -1197,7 +1407,19 @@
         <w:rPr>
           <w:color w:val="0D1B2A"/>
         </w:rPr>
-        <w:t>For people with dyslexia, one or more steps in the reading pipeline require conscious effort — turning what should be automatic into an exhausting cognitive task. For people with visual processing disorders, the page itself is the problem: letters crowd and shift, lines blur, and the visual input is not processed cleanly. RSVP removes both failure modes at the source.</w:t>
+        <w:t xml:space="preserve">For people with dyslexia, one or more steps in the reading pipeline require conscious effort </w:t>
+      </w:r>
+      <w:r>
+        <w:rPr>
+          <w:color w:val="0D1B2A"/>
+        </w:rPr>
+        <w:t>-</w:t>
+      </w:r>
+      <w:r>
+        <w:rPr>
+          <w:color w:val="0D1B2A"/>
+        </w:rPr>
+        <w:t xml:space="preserve"> turning what should be automatic into an exhausting cognitive task. For people with visual processing disorders, the page itself is the problem: letters crowd and shift, lines blur, and the visual input is not processed cleanly. RSVP removes both failure modes at the source.</w:t>
       </w:r>
     </w:p>
     <w:p/>
@@ -1217,7 +1439,19 @@
         <w:rPr>
           <w:color w:val="0D1B2A"/>
         </w:rPr>
-        <w:t>Research by Brysbaert &amp; Nazir (1998) identified the Optimal Recognition Point: the specific character position within each word where the brain’s lexical recognition fires most rapidly. This is not the center of the word — it is slightly left of center, varying by word length:</w:t>
+        <w:t xml:space="preserve">Research by Brysbaert &amp; Nazir (1998) identified the Optimal Recognition Point: the specific character position within each word where the brain’s lexical recognition fires most rapidly. This is not the center of the word </w:t>
+      </w:r>
+      <w:r>
+        <w:rPr>
+          <w:color w:val="0D1B2A"/>
+        </w:rPr>
+        <w:t>-</w:t>
+      </w:r>
+      <w:r>
+        <w:rPr>
+          <w:color w:val="0D1B2A"/>
+        </w:rPr>
+        <w:t xml:space="preserve"> it is slightly left of center, varying by word length:</w:t>
       </w:r>
     </w:p>
     <w:p>
@@ -1249,7 +1483,25 @@
         <w:rPr>
           <w:color w:val="0D1B2A"/>
         </w:rPr>
-        <w:t>Longer words: ORP shifts right but stays in the first third — where the most informative letters appear</w:t>
+        <w:t xml:space="preserve">Longer words: ORP shifts right but stays in the first third </w:t>
+      </w:r>
+      <w:r>
+        <w:rPr>
+          <w:color w:val="0D1B2A"/>
+        </w:rPr>
+        <w:t>-</w:t>
+      </w:r>
+      <w:r>
+        <w:rPr>
+          <w:color w:val="0D1B2A"/>
+        </w:rPr>
+        <w:t xml:space="preserve"> where the most informative letters </w:t>
+      </w:r>
+      <w:r>
+        <w:rPr>
+          <w:color w:val="0D1B2A"/>
+        </w:rPr>
+        <w:t>appear.</w:t>
       </w:r>
     </w:p>
     <w:p/>
@@ -1261,7 +1513,19 @@
         <w:rPr>
           <w:color w:val="0D1B2A"/>
         </w:rPr>
-        <w:t>Focal aligns every word to its ORP at a fixed screen position. The highlighted character in the display marks this point. The reader’s visual system never searches for where to look — every word arrives exactly where recognition is fastest.</w:t>
+        <w:t xml:space="preserve">Focal aligns every word to its ORP at a fixed screen position. The highlighted character in the display marks this point. The reader’s visual system never searches for where to look </w:t>
+      </w:r>
+      <w:r>
+        <w:rPr>
+          <w:color w:val="0D1B2A"/>
+        </w:rPr>
+        <w:t>-</w:t>
+      </w:r>
+      <w:r>
+        <w:rPr>
+          <w:color w:val="0D1B2A"/>
+        </w:rPr>
+        <w:t xml:space="preserve"> every word arrives exactly where recognition is fastest.</w:t>
       </w:r>
     </w:p>
     <w:p/>
@@ -1298,7 +1562,13 @@
           <w:color w:val="0D1B2A"/>
         </w:rPr>
         <w:lastRenderedPageBreak/>
-        <w:t>Longer words receive proportionally more display time, preventing truncated processing</w:t>
+        <w:t xml:space="preserve">Longer words receive proportionally more display time, preventing truncated </w:t>
+      </w:r>
+      <w:r>
+        <w:rPr>
+          <w:color w:val="0D1B2A"/>
+        </w:rPr>
+        <w:t>processing.</w:t>
       </w:r>
     </w:p>
     <w:p>
@@ -1314,7 +1584,25 @@
         <w:rPr>
           <w:color w:val="0D1B2A"/>
         </w:rPr>
-        <w:t>Punctuation triggers natural pauses — a period adds a half-beat, simulating natural speech cadence</w:t>
+        <w:t xml:space="preserve">Punctuation triggers natural pauses </w:t>
+      </w:r>
+      <w:r>
+        <w:rPr>
+          <w:color w:val="0D1B2A"/>
+        </w:rPr>
+        <w:t>-</w:t>
+      </w:r>
+      <w:r>
+        <w:rPr>
+          <w:color w:val="0D1B2A"/>
+        </w:rPr>
+        <w:t xml:space="preserve"> a period adds a half-beat, simulating natural speech </w:t>
+      </w:r>
+      <w:r>
+        <w:rPr>
+          <w:color w:val="0D1B2A"/>
+        </w:rPr>
+        <w:t>cadence.</w:t>
       </w:r>
     </w:p>
     <w:p>
@@ -1330,7 +1618,13 @@
         <w:rPr>
           <w:color w:val="0D1B2A"/>
         </w:rPr>
-        <w:t>Paragraph breaks introduce longer pauses, giving the brain the mental reset it expects between sections</w:t>
+        <w:t xml:space="preserve">Paragraph breaks introduce longer pauses, giving the brain the mental reset it expects between </w:t>
+      </w:r>
+      <w:r>
+        <w:rPr>
+          <w:color w:val="0D1B2A"/>
+        </w:rPr>
+        <w:t>sections.</w:t>
       </w:r>
     </w:p>
     <w:p>
@@ -1341,7 +1635,19 @@
         <w:rPr>
           <w:color w:val="0D1B2A"/>
         </w:rPr>
-        <w:t>The result is a reading experience that feels like reading — not like watching a ticker tape.</w:t>
+        <w:t xml:space="preserve">The result is a reading experience that feels like reading </w:t>
+      </w:r>
+      <w:r>
+        <w:rPr>
+          <w:color w:val="0D1B2A"/>
+        </w:rPr>
+        <w:t>-</w:t>
+      </w:r>
+      <w:r>
+        <w:rPr>
+          <w:color w:val="0D1B2A"/>
+        </w:rPr>
+        <w:t xml:space="preserve"> not like watching a ticker tape.</w:t>
       </w:r>
     </w:p>
     <w:p/>
@@ -1845,7 +2151,31 @@
         <w:rPr>
           <w:color w:val="0D1B2A"/>
         </w:rPr>
-        <w:t>RSVP as a reading paradigm emerged from cognitive psychology in the 1960s. Forster (1970) and Potter (1984) established it as a rigorous method for studying reading cognition. Brysbaert &amp; Nazir (1998) quantified the ORP. For decades the technique remained in the laboratory — genuinely useful, but without a delivery mechanism to reach the people who needed it.</w:t>
+        <w:t xml:space="preserve">RSVP as a reading paradigm emerged from cognitive psychology in the 1960s. Forster (1970) and Potter (1984) established it as a rigorous method for studying reading cognition. Brysbaert &amp; Nazir (1998) quantified the ORP. For </w:t>
+      </w:r>
+      <w:r>
+        <w:rPr>
+          <w:color w:val="0D1B2A"/>
+        </w:rPr>
+        <w:t>decades,</w:t>
+      </w:r>
+      <w:r>
+        <w:rPr>
+          <w:color w:val="0D1B2A"/>
+        </w:rPr>
+        <w:t xml:space="preserve"> the technique remained in the laboratory </w:t>
+      </w:r>
+      <w:r>
+        <w:rPr>
+          <w:color w:val="0D1B2A"/>
+        </w:rPr>
+        <w:t>-</w:t>
+      </w:r>
+      <w:r>
+        <w:rPr>
+          <w:color w:val="0D1B2A"/>
+        </w:rPr>
+        <w:t xml:space="preserve"> genuinely useful, but without a delivery mechanism to reach the people who needed it.</w:t>
       </w:r>
     </w:p>
     <w:p/>
@@ -1865,7 +2195,19 @@
         <w:rPr>
           <w:color w:val="0D1B2A"/>
         </w:rPr>
-        <w:t>In 2014, Spritz Technologies launched publicly with integrations into Samsung’s Galaxy S5 and Gear 2 — screens too small for traditional reading. Their demo showing users reading at 500 WPM within seconds of introduction went massively viral, proving three things: RSVP is immediately intuitive, general audiences respond strongly, and the technology has real commercial appeal.</w:t>
+        <w:t xml:space="preserve">In 2014, Spritz Technologies launched publicly with integrations into Samsung’s Galaxy S5 and Gear 2 </w:t>
+      </w:r>
+      <w:r>
+        <w:rPr>
+          <w:color w:val="0D1B2A"/>
+        </w:rPr>
+        <w:t>-</w:t>
+      </w:r>
+      <w:r>
+        <w:rPr>
+          <w:color w:val="0D1B2A"/>
+        </w:rPr>
+        <w:t xml:space="preserve"> screens too small for traditional reading. Their demo showing users reading at 500 WPM within seconds of introduction went massively viral, proving three things: RSVP is immediately intuitive, general audiences respond strongly, and the technology has real commercial appeal.</w:t>
       </w:r>
     </w:p>
     <w:p>
@@ -1892,7 +2234,25 @@
         <w:rPr>
           <w:color w:val="0D1B2A"/>
         </w:rPr>
-        <w:t>Proprietary and licensed — free access was restricted</w:t>
+        <w:t xml:space="preserve">Proprietary and licensed </w:t>
+      </w:r>
+      <w:r>
+        <w:rPr>
+          <w:color w:val="0D1B2A"/>
+        </w:rPr>
+        <w:t>-</w:t>
+      </w:r>
+      <w:r>
+        <w:rPr>
+          <w:color w:val="0D1B2A"/>
+        </w:rPr>
+        <w:t xml:space="preserve"> free access was </w:t>
+      </w:r>
+      <w:r>
+        <w:rPr>
+          <w:color w:val="0D1B2A"/>
+        </w:rPr>
+        <w:t>restricted.</w:t>
       </w:r>
     </w:p>
     <w:p>
@@ -1908,7 +2268,25 @@
         <w:rPr>
           <w:color w:val="0D1B2A"/>
         </w:rPr>
-        <w:t>No text import — limited to Spritz-partnered content</w:t>
+        <w:t xml:space="preserve">No text import </w:t>
+      </w:r>
+      <w:r>
+        <w:rPr>
+          <w:color w:val="0D1B2A"/>
+        </w:rPr>
+        <w:t>-</w:t>
+      </w:r>
+      <w:r>
+        <w:rPr>
+          <w:color w:val="0D1B2A"/>
+        </w:rPr>
+        <w:t xml:space="preserve"> limited to Spritz-partnered </w:t>
+      </w:r>
+      <w:r>
+        <w:rPr>
+          <w:color w:val="0D1B2A"/>
+        </w:rPr>
+        <w:t>content.</w:t>
       </w:r>
     </w:p>
     <w:p>
@@ -1924,7 +2302,43 @@
         <w:rPr>
           <w:color w:val="0D1B2A"/>
         </w:rPr>
-        <w:t>No customisation — speed, display, and font were largely fixed</w:t>
+        <w:t xml:space="preserve">No </w:t>
+      </w:r>
+      <w:r>
+        <w:rPr>
+          <w:color w:val="0D1B2A"/>
+        </w:rPr>
+        <w:t>customization</w:t>
+      </w:r>
+      <w:r>
+        <w:rPr>
+          <w:color w:val="0D1B2A"/>
+        </w:rPr>
+        <w:t xml:space="preserve"> </w:t>
+      </w:r>
+      <w:r>
+        <w:rPr>
+          <w:color w:val="0D1B2A"/>
+        </w:rPr>
+        <w:t>-</w:t>
+      </w:r>
+      <w:r>
+        <w:rPr>
+          <w:color w:val="0D1B2A"/>
+        </w:rPr>
+        <w:t xml:space="preserve"> speed, display, and font were </w:t>
+      </w:r>
+      <w:r>
+        <w:rPr>
+          <w:color w:val="0D1B2A"/>
+        </w:rPr>
+        <w:t>fixed</w:t>
+      </w:r>
+      <w:r>
+        <w:rPr>
+          <w:color w:val="0D1B2A"/>
+        </w:rPr>
+        <w:t>.</w:t>
       </w:r>
     </w:p>
     <w:p>
@@ -1940,7 +2354,25 @@
         <w:rPr>
           <w:color w:val="0D1B2A"/>
         </w:rPr>
-        <w:t>No accessibility focus — built for speed, not inclusion</w:t>
+        <w:t xml:space="preserve">No accessibility focus </w:t>
+      </w:r>
+      <w:r>
+        <w:rPr>
+          <w:color w:val="0D1B2A"/>
+        </w:rPr>
+        <w:t>-</w:t>
+      </w:r>
+      <w:r>
+        <w:rPr>
+          <w:color w:val="0D1B2A"/>
+        </w:rPr>
+        <w:t xml:space="preserve"> built for speed, not </w:t>
+      </w:r>
+      <w:r>
+        <w:rPr>
+          <w:color w:val="0D1B2A"/>
+        </w:rPr>
+        <w:t>inclusion.</w:t>
       </w:r>
     </w:p>
     <w:p>
@@ -1972,7 +2404,25 @@
         <w:rPr>
           <w:color w:val="0D1B2A"/>
         </w:rPr>
-        <w:t>Abandoned — Spritz went quiet by the late 2010s</w:t>
+        <w:t xml:space="preserve">Abandoned </w:t>
+      </w:r>
+      <w:r>
+        <w:rPr>
+          <w:color w:val="0D1B2A"/>
+        </w:rPr>
+        <w:t>-</w:t>
+      </w:r>
+      <w:r>
+        <w:rPr>
+          <w:color w:val="0D1B2A"/>
+        </w:rPr>
+        <w:t xml:space="preserve"> Spritz went quiet by the late </w:t>
+      </w:r>
+      <w:r>
+        <w:rPr>
+          <w:color w:val="0D1B2A"/>
+        </w:rPr>
+        <w:t>2010s.</w:t>
       </w:r>
     </w:p>
     <w:p/>
@@ -1992,7 +2442,43 @@
         <w:rPr>
           <w:color w:val="0D1B2A"/>
         </w:rPr>
-        <w:t>Following Spritz’s viral moment, a small ecosystem of minimal tools emerged — browser extensions, basic apps, web utilities. Most treated RSVP as a speed trick. None addressed the full picture: the user with dyslexia who needs an OpenDyslexic font and a tinted background; the user with ADHD who needs a session timer; the user with processing speed deficits who reads at 80 WPM and needs the tool to meet them there without judgment.</w:t>
+        <w:t xml:space="preserve">Following Spritz’s viral moment, a small ecosystem of minimal tools emerged </w:t>
+      </w:r>
+      <w:r>
+        <w:rPr>
+          <w:color w:val="0D1B2A"/>
+        </w:rPr>
+        <w:t>-</w:t>
+      </w:r>
+      <w:r>
+        <w:rPr>
+          <w:color w:val="0D1B2A"/>
+        </w:rPr>
+        <w:t xml:space="preserve"> browser extensions, basic apps</w:t>
+      </w:r>
+      <w:r>
+        <w:rPr>
+          <w:color w:val="0D1B2A"/>
+        </w:rPr>
+        <w:t>, and web</w:t>
+      </w:r>
+      <w:r>
+        <w:rPr>
+          <w:color w:val="0D1B2A"/>
+        </w:rPr>
+        <w:t xml:space="preserve"> utilities. Most treated RSVP as a speed trick. None addressed the full picture: the user with dyslexia who needs an </w:t>
+      </w:r>
+      <w:r>
+        <w:rPr>
+          <w:color w:val="0D1B2A"/>
+        </w:rPr>
+        <w:t>Open Dyslexic</w:t>
+      </w:r>
+      <w:r>
+        <w:rPr>
+          <w:color w:val="0D1B2A"/>
+        </w:rPr>
+        <w:t xml:space="preserve"> font and a tinted background; the user with ADHD who needs a session timer; the user with processing speed deficits who reads at 80 WPM and needs the tool to meet them there without judgment.</w:t>
       </w:r>
     </w:p>
     <w:p/>
@@ -3016,7 +3502,23 @@
                 <w:sz w:val="18"/>
                 <w:szCs w:val="18"/>
               </w:rPr>
-              <w:t>Dyslexia font (OpenDyslexic)</w:t>
+              <w:t>Dyslexia font (</w:t>
+            </w:r>
+            <w:r>
+              <w:rPr>
+                <w:color w:val="0D1B2A"/>
+                <w:sz w:val="18"/>
+                <w:szCs w:val="18"/>
+              </w:rPr>
+              <w:t>Open Dyslexic</w:t>
+            </w:r>
+            <w:r>
+              <w:rPr>
+                <w:color w:val="0D1B2A"/>
+                <w:sz w:val="18"/>
+                <w:szCs w:val="18"/>
+              </w:rPr>
+              <w:t>)</w:t>
             </w:r>
           </w:p>
         </w:tc>
@@ -3596,7 +4098,15 @@
                 <w:sz w:val="18"/>
                 <w:szCs w:val="18"/>
               </w:rPr>
-              <w:t>AI analysis / summarisation</w:t>
+              <w:t xml:space="preserve">AI analysis / </w:t>
+            </w:r>
+            <w:r>
+              <w:rPr>
+                <w:color w:val="0D1B2A"/>
+                <w:sz w:val="18"/>
+                <w:szCs w:val="18"/>
+              </w:rPr>
+              <w:t>summarization</w:t>
             </w:r>
           </w:p>
         </w:tc>
@@ -4786,7 +5296,19 @@
         <w:rPr>
           <w:color w:val="0D1B2A"/>
         </w:rPr>
-        <w:t>Throughout modern history, the most widely adopted technologies in daily use were not invented for the mainstream. They were invented for people at the margins — and then they went everywhere.</w:t>
+        <w:t xml:space="preserve">Throughout modern history, the most widely adopted technologies in daily use were not invented for the mainstream. They were invented for people at the margins </w:t>
+      </w:r>
+      <w:r>
+        <w:rPr>
+          <w:color w:val="0D1B2A"/>
+        </w:rPr>
+        <w:t>-</w:t>
+      </w:r>
+      <w:r>
+        <w:rPr>
+          <w:color w:val="0D1B2A"/>
+        </w:rPr>
+        <w:t xml:space="preserve"> and then they went everywhere.</w:t>
       </w:r>
     </w:p>
     <w:p/>
@@ -5108,7 +5630,23 @@
                 <w:sz w:val="19"/>
                 <w:szCs w:val="19"/>
               </w:rPr>
-              <w:t>Deaf and hard-of-hearing viewers → millions watching video in public, noisy spaces</w:t>
+              <w:t xml:space="preserve">Deaf and hard-of-hearing viewers → millions watching </w:t>
+            </w:r>
+            <w:r>
+              <w:rPr>
+                <w:color w:val="0D1B2A"/>
+                <w:sz w:val="19"/>
+                <w:szCs w:val="19"/>
+              </w:rPr>
+              <w:t>videos</w:t>
+            </w:r>
+            <w:r>
+              <w:rPr>
+                <w:color w:val="0D1B2A"/>
+                <w:sz w:val="19"/>
+                <w:szCs w:val="19"/>
+              </w:rPr>
+              <w:t xml:space="preserve"> in public, noisy spaces</w:t>
             </w:r>
           </w:p>
         </w:tc>
@@ -5363,7 +5901,19 @@
         <w:rPr>
           <w:color w:val="0D1B2A"/>
         </w:rPr>
-        <w:t>This phenomenon is called the Curb Cut Effect: design for the margins, improve the centre.</w:t>
+        <w:t xml:space="preserve">This phenomenon is called the Curb Cut Effect: design for </w:t>
+      </w:r>
+      <w:r>
+        <w:rPr>
+          <w:color w:val="0D1B2A"/>
+        </w:rPr>
+        <w:t>margins</w:t>
+      </w:r>
+      <w:r>
+        <w:rPr>
+          <w:color w:val="0D1B2A"/>
+        </w:rPr>
+        <w:t>, improve the centre.</w:t>
       </w:r>
     </w:p>
     <w:tbl>
@@ -5444,7 +5994,31 @@
               <w:rPr>
                 <w:color w:val="0D1B2A"/>
               </w:rPr>
-              <w:t>RSVP technology follows the same arc. Studied for decades as a tool for readers for whom standard text was inaccessible. Focal makes it available to everyone — with the people who need it most at the centre of the design, not the footnote.</w:t>
+              <w:t xml:space="preserve">RSVP technology follows the same arc. </w:t>
+            </w:r>
+            <w:r>
+              <w:rPr>
+                <w:color w:val="0D1B2A"/>
+              </w:rPr>
+              <w:t>Studying</w:t>
+            </w:r>
+            <w:r>
+              <w:rPr>
+                <w:color w:val="0D1B2A"/>
+              </w:rPr>
+              <w:t xml:space="preserve"> for decades as a tool for readers for whom standard text was inaccessible. Focal makes it available to everyone </w:t>
+            </w:r>
+            <w:r>
+              <w:rPr>
+                <w:color w:val="0D1B2A"/>
+              </w:rPr>
+              <w:t>-</w:t>
+            </w:r>
+            <w:r>
+              <w:rPr>
+                <w:color w:val="0D1B2A"/>
+              </w:rPr>
+              <w:t xml:space="preserve"> with the people who need it most at the centre of the design, not the footnote.</w:t>
             </w:r>
           </w:p>
         </w:tc>
@@ -5459,7 +6033,55 @@
         <w:rPr>
           <w:color w:val="0D1B2A"/>
         </w:rPr>
-        <w:t>The commercial logic is direct: a tool built with genuine accessibility rigour is also, necessarily, a tool built with exceptional attention to customisation, flexibility, and user experience. Accessibility requirements are the most demanding UX brief in existence. When you solve for them, you solve for everyone.</w:t>
+        <w:t xml:space="preserve">The commercial logic is direct: a tool built with genuine accessibility </w:t>
+      </w:r>
+      <w:r>
+        <w:rPr>
+          <w:color w:val="0D1B2A"/>
+        </w:rPr>
+        <w:t>rigor</w:t>
+      </w:r>
+      <w:r>
+        <w:rPr>
+          <w:color w:val="0D1B2A"/>
+        </w:rPr>
+        <w:t xml:space="preserve"> is also, necessarily, a tool built with exceptional attention to </w:t>
+      </w:r>
+      <w:r>
+        <w:rPr>
+          <w:color w:val="0D1B2A"/>
+        </w:rPr>
+        <w:t>customization</w:t>
+      </w:r>
+      <w:r>
+        <w:rPr>
+          <w:color w:val="0D1B2A"/>
+        </w:rPr>
+        <w:t xml:space="preserve">, flexibility, and user experience. Accessibility requirements are the most demanding UX brief in existence. When you </w:t>
+      </w:r>
+      <w:r>
+        <w:rPr>
+          <w:color w:val="0D1B2A"/>
+        </w:rPr>
+        <w:t>solve</w:t>
+      </w:r>
+      <w:r>
+        <w:rPr>
+          <w:color w:val="0D1B2A"/>
+        </w:rPr>
+        <w:t xml:space="preserve"> them, you </w:t>
+      </w:r>
+      <w:r>
+        <w:rPr>
+          <w:color w:val="0D1B2A"/>
+        </w:rPr>
+        <w:t>solve them</w:t>
+      </w:r>
+      <w:r>
+        <w:rPr>
+          <w:color w:val="0D1B2A"/>
+        </w:rPr>
+        <w:t xml:space="preserve"> for everyone.</w:t>
       </w:r>
     </w:p>
     <w:p>
@@ -5485,7 +6107,13 @@
         <w:pStyle w:val="Heading2"/>
       </w:pPr>
       <w:r>
-        <w:t>A Platform, Not a Feature</w:t>
+        <w:t xml:space="preserve">A Platform, </w:t>
+      </w:r>
+      <w:r>
+        <w:t>not</w:t>
+      </w:r>
+      <w:r>
+        <w:t xml:space="preserve"> a Feature</w:t>
       </w:r>
     </w:p>
     <w:p>
@@ -5496,7 +6124,31 @@
         <w:rPr>
           <w:color w:val="0D1B2A"/>
         </w:rPr>
-        <w:t>Focal is a single-file Progressive Web App. It installs on any device, works fully offline, and requires no account, subscription, or infrastructure to use. All user data — preferences, library texts, session history — is stored in localStorage and IndexedDB on the device. Nothing leaves the browser.</w:t>
+        <w:t xml:space="preserve">Focal is a single-file Progressive Web App. It installs on any device, works fully offline, and requires no account, subscription, or infrastructure to use. All user data </w:t>
+      </w:r>
+      <w:r>
+        <w:rPr>
+          <w:color w:val="0D1B2A"/>
+        </w:rPr>
+        <w:t>-</w:t>
+      </w:r>
+      <w:r>
+        <w:rPr>
+          <w:color w:val="0D1B2A"/>
+        </w:rPr>
+        <w:t xml:space="preserve"> preferences, library texts, session history </w:t>
+      </w:r>
+      <w:r>
+        <w:rPr>
+          <w:color w:val="0D1B2A"/>
+        </w:rPr>
+        <w:t>-</w:t>
+      </w:r>
+      <w:r>
+        <w:rPr>
+          <w:color w:val="0D1B2A"/>
+        </w:rPr>
+        <w:t xml:space="preserve"> is stored in localStorage and IndexedDB on the device. Nothing leaves the browser.</w:t>
       </w:r>
     </w:p>
     <w:p/>
@@ -5569,7 +6221,25 @@
         <w:rPr>
           <w:color w:val="0D1B2A"/>
         </w:rPr>
-        <w:t>Ramp mode — gradual speed acceleration from a configurable starting pace</w:t>
+        <w:t xml:space="preserve">Ramp mode </w:t>
+      </w:r>
+      <w:r>
+        <w:rPr>
+          <w:color w:val="0D1B2A"/>
+        </w:rPr>
+        <w:t>-</w:t>
+      </w:r>
+      <w:r>
+        <w:rPr>
+          <w:color w:val="0D1B2A"/>
+        </w:rPr>
+        <w:t xml:space="preserve"> gradual speed acceleration from a configurable starting </w:t>
+      </w:r>
+      <w:r>
+        <w:rPr>
+          <w:color w:val="0D1B2A"/>
+        </w:rPr>
+        <w:t>pace.</w:t>
       </w:r>
     </w:p>
     <w:p>
@@ -5588,7 +6258,16 @@
         <w:t>Reading Display Mode</w:t>
       </w:r>
       <w:r>
-        <w:t xml:space="preserve"> — typography adapts to cognitive goal: Scan (light Inter, open spacing) for high-WPM skimming, Deep (bold Georgia serif) for comprehension, Auto switches in real-time based on WPM</w:t>
+        <w:t xml:space="preserve"> </w:t>
+      </w:r>
+      <w:r>
+        <w:t>-</w:t>
+      </w:r>
+      <w:r>
+        <w:t xml:space="preserve"> typography adapts to cognitive goal: Scan (light Inter, open spacing) for high-WPM skimming, Deep (bold Georgia serif) for comprehension, Auto switches in real-time based on </w:t>
+      </w:r>
+      <w:r>
+        <w:t>WPM.</w:t>
       </w:r>
     </w:p>
     <w:p>
@@ -5620,7 +6299,13 @@
         <w:rPr>
           <w:color w:val="0D1B2A"/>
         </w:rPr>
-        <w:t>Sentence context view with click-to-seek on any word</w:t>
+        <w:t xml:space="preserve">Sentence context view with click-to-seek on any </w:t>
+      </w:r>
+      <w:r>
+        <w:rPr>
+          <w:color w:val="0D1B2A"/>
+        </w:rPr>
+        <w:t>word.</w:t>
       </w:r>
     </w:p>
     <w:p>
@@ -5658,13 +6343,19 @@
         <w:spacing w:before="40" w:after="80"/>
       </w:pPr>
       <w:r>
-        <w:t xml:space="preserve">Two clinically-designed accessible fonts: </w:t>
+        <w:t xml:space="preserve">Two </w:t>
+      </w:r>
+      <w:r>
+        <w:t>clinically designed</w:t>
+      </w:r>
+      <w:r>
+        <w:t xml:space="preserve"> accessible fonts: </w:t>
       </w:r>
       <w:r>
         <w:rPr>
           <w:b/>
         </w:rPr>
-        <w:t>OpenDyslexic</w:t>
+        <w:t>Open Dyslexic</w:t>
       </w:r>
       <w:r>
         <w:t xml:space="preserve"> (weighted letter bottoms prevent b/d/p/q reversal) and </w:t>
@@ -5676,7 +6367,22 @@
         <w:t>Atkinson Hyperlegible</w:t>
       </w:r>
       <w:r>
-        <w:t xml:space="preserve"> (maximised inter-character differentiation for low vision) — one-click toggle</w:t>
+        <w:t xml:space="preserve"> (</w:t>
+      </w:r>
+      <w:r>
+        <w:t>maximized</w:t>
+      </w:r>
+      <w:r>
+        <w:t xml:space="preserve"> inter-character differentiation for low </w:t>
+      </w:r>
+      <w:r>
+        <w:t>vision)</w:t>
+      </w:r>
+      <w:r>
+        <w:t xml:space="preserve"> one-click </w:t>
+      </w:r>
+      <w:r>
+        <w:t>toggle.</w:t>
       </w:r>
     </w:p>
     <w:p>
@@ -5724,7 +6430,19 @@
         <w:rPr>
           <w:color w:val="0D1B2A"/>
         </w:rPr>
-        <w:t>Dark / light themes with per-theme colour inheritance</w:t>
+        <w:t xml:space="preserve">Dark / light themes with per-theme </w:t>
+      </w:r>
+      <w:r>
+        <w:rPr>
+          <w:color w:val="0D1B2A"/>
+        </w:rPr>
+        <w:t>color</w:t>
+      </w:r>
+      <w:r>
+        <w:rPr>
+          <w:color w:val="0D1B2A"/>
+        </w:rPr>
+        <w:t xml:space="preserve"> inheritance</w:t>
       </w:r>
     </w:p>
     <w:p>
@@ -5740,7 +6458,49 @@
         <w:rPr>
           <w:color w:val="0D1B2A"/>
         </w:rPr>
-        <w:t>Accent colour customisation with colour-blind-friendly presets</w:t>
+        <w:t xml:space="preserve">Accent </w:t>
+      </w:r>
+      <w:r>
+        <w:rPr>
+          <w:color w:val="0D1B2A"/>
+        </w:rPr>
+        <w:t>color</w:t>
+      </w:r>
+      <w:r>
+        <w:rPr>
+          <w:color w:val="0D1B2A"/>
+        </w:rPr>
+        <w:t xml:space="preserve"> </w:t>
+      </w:r>
+      <w:r>
+        <w:rPr>
+          <w:color w:val="0D1B2A"/>
+        </w:rPr>
+        <w:t>customization</w:t>
+      </w:r>
+      <w:r>
+        <w:rPr>
+          <w:color w:val="0D1B2A"/>
+        </w:rPr>
+        <w:t xml:space="preserve"> with </w:t>
+      </w:r>
+      <w:r>
+        <w:rPr>
+          <w:color w:val="0D1B2A"/>
+        </w:rPr>
+        <w:t>color</w:t>
+      </w:r>
+      <w:r>
+        <w:rPr>
+          <w:color w:val="0D1B2A"/>
+        </w:rPr>
+        <w:t xml:space="preserve">-blind-friendly </w:t>
+      </w:r>
+      <w:r>
+        <w:rPr>
+          <w:color w:val="0D1B2A"/>
+        </w:rPr>
+        <w:t>presets.</w:t>
       </w:r>
     </w:p>
     <w:p>
@@ -5756,7 +6516,13 @@
         <w:rPr>
           <w:color w:val="0D1B2A"/>
         </w:rPr>
-        <w:t>prefers-reduced-motion: all animations suppressed at OS level when requested</w:t>
+        <w:t xml:space="preserve">prefers-reduced-motion: all animations suppressed at OS level when </w:t>
+      </w:r>
+      <w:r>
+        <w:rPr>
+          <w:color w:val="0D1B2A"/>
+        </w:rPr>
+        <w:t>requested.</w:t>
       </w:r>
     </w:p>
     <w:p>
@@ -5797,7 +6563,25 @@
         <w:rPr>
           <w:color w:val="0D1B2A"/>
         </w:rPr>
-        <w:t>AI analysis powered by Groq (Llama 3.3 70B) — ultra-low latency inference</w:t>
+        <w:t>AI analysis powered by Groq (Llama 3.3 70</w:t>
+      </w:r>
+      <w:r>
+        <w:rPr>
+          <w:color w:val="0D1B2A"/>
+        </w:rPr>
+        <w:t>B)</w:t>
+      </w:r>
+      <w:r>
+        <w:rPr>
+          <w:color w:val="0D1B2A"/>
+        </w:rPr>
+        <w:t xml:space="preserve"> ultra-low latency </w:t>
+      </w:r>
+      <w:r>
+        <w:rPr>
+          <w:color w:val="0D1B2A"/>
+        </w:rPr>
+        <w:t>inference.</w:t>
       </w:r>
     </w:p>
     <w:p>
@@ -5813,7 +6597,25 @@
         <w:rPr>
           <w:color w:val="0D1B2A"/>
         </w:rPr>
-        <w:t>Interactive quizzes: multiple-choice, true/false, fill-in-the-blank — AI-generated, auto-graded, scores tracked per text</w:t>
+        <w:t xml:space="preserve">Interactive quizzes: multiple-choice, true/false, fill-in-the-blank </w:t>
+      </w:r>
+      <w:r>
+        <w:rPr>
+          <w:color w:val="0D1B2A"/>
+        </w:rPr>
+        <w:t>-</w:t>
+      </w:r>
+      <w:r>
+        <w:rPr>
+          <w:color w:val="0D1B2A"/>
+        </w:rPr>
+        <w:t xml:space="preserve"> AI-generated, auto-graded, scores tracked per </w:t>
+      </w:r>
+      <w:r>
+        <w:rPr>
+          <w:color w:val="0D1B2A"/>
+        </w:rPr>
+        <w:t>text.</w:t>
       </w:r>
     </w:p>
     <w:p>
@@ -5829,7 +6631,14 @@
         <w:rPr>
           <w:color w:val="0D1B2A"/>
         </w:rPr>
-        <w:t>Summarise, Key Points, Explain Simply, Reading Level, Comprehension Check</w:t>
+        <w:lastRenderedPageBreak/>
+        <w:t>Summarize</w:t>
+      </w:r>
+      <w:r>
+        <w:rPr>
+          <w:color w:val="0D1B2A"/>
+        </w:rPr>
+        <w:t>, Key Points, Explain Simply, Reading Level, Comprehension Check</w:t>
       </w:r>
     </w:p>
     <w:p>
@@ -5845,7 +6654,13 @@
         <w:rPr>
           <w:color w:val="0D1B2A"/>
         </w:rPr>
-        <w:t>AI Psychometric Insights: clinical-quality analysis referencing Hasbrouck &amp; Tindal norms and DIBELS framework</w:t>
+        <w:t xml:space="preserve">AI Psychometric Insights: clinical-quality analysis referencing Hasbrouck &amp; Tindal norms and DIBELS </w:t>
+      </w:r>
+      <w:r>
+        <w:rPr>
+          <w:color w:val="0D1B2A"/>
+        </w:rPr>
+        <w:t>framework.</w:t>
       </w:r>
     </w:p>
     <w:p>
@@ -5861,7 +6676,13 @@
         <w:rPr>
           <w:color w:val="0D1B2A"/>
         </w:rPr>
-        <w:t>Import from TXT, PDF (PDF.js), EPUB (JSZip), DOCX (Mammoth.js), Markdown, RTF, HTML, CSV, and URL fetch</w:t>
+        <w:t xml:space="preserve">Import from TXT, PDF (PDF.js), EPUB (JSZip), DOCX (Mammoth.js), Markdown, RTF, HTML, CSV, and URL </w:t>
+      </w:r>
+      <w:r>
+        <w:rPr>
+          <w:color w:val="0D1B2A"/>
+        </w:rPr>
+        <w:t>fetch.</w:t>
       </w:r>
     </w:p>
     <w:p/>
@@ -5886,7 +6707,19 @@
         <w:rPr>
           <w:color w:val="0D1B2A"/>
         </w:rPr>
-        <w:t>Consistency (CV%): WPM coefficient of variation — flags attention and decoding issues</w:t>
+        <w:t xml:space="preserve">Consistency (CV%): WPM coefficient of variation </w:t>
+      </w:r>
+      <w:r>
+        <w:rPr>
+          <w:color w:val="0D1B2A"/>
+        </w:rPr>
+        <w:t>-</w:t>
+      </w:r>
+      <w:r>
+        <w:rPr>
+          <w:color w:val="0D1B2A"/>
+        </w:rPr>
+        <w:t xml:space="preserve"> flags attention and decoding issues</w:t>
       </w:r>
     </w:p>
     <w:p>
@@ -5902,7 +6735,13 @@
         <w:rPr>
           <w:color w:val="0D1B2A"/>
         </w:rPr>
-        <w:t>Avg Focus: sustained attention span measured between play and pause events</w:t>
+        <w:t xml:space="preserve">Avg Focus: sustained attention span measured between play and pause </w:t>
+      </w:r>
+      <w:r>
+        <w:rPr>
+          <w:color w:val="0D1B2A"/>
+        </w:rPr>
+        <w:t>events.</w:t>
       </w:r>
     </w:p>
     <w:p>
@@ -5918,7 +6757,19 @@
         <w:rPr>
           <w:color w:val="0D1B2A"/>
         </w:rPr>
-        <w:t>Regressions: backward navigation rate per 1,000 words — comprehension difficulty indicator</w:t>
+        <w:t xml:space="preserve">Regressions: backward navigation rate per 1,000 words </w:t>
+      </w:r>
+      <w:r>
+        <w:rPr>
+          <w:color w:val="0D1B2A"/>
+        </w:rPr>
+        <w:t>-</w:t>
+      </w:r>
+      <w:r>
+        <w:rPr>
+          <w:color w:val="0D1B2A"/>
+        </w:rPr>
+        <w:t xml:space="preserve"> comprehension difficulty indicator</w:t>
       </w:r>
     </w:p>
     <w:p>
@@ -5934,7 +6785,19 @@
         <w:rPr>
           <w:color w:val="0D1B2A"/>
         </w:rPr>
-        <w:t>Stamina: WPM decline ratio within sessions — measures reading fatigue</w:t>
+        <w:t xml:space="preserve">Stamina: WPM decline ratio within sessions </w:t>
+      </w:r>
+      <w:r>
+        <w:rPr>
+          <w:color w:val="0D1B2A"/>
+        </w:rPr>
+        <w:t>-</w:t>
+      </w:r>
+      <w:r>
+        <w:rPr>
+          <w:color w:val="0D1B2A"/>
+        </w:rPr>
+        <w:t xml:space="preserve"> measures reading fatigue</w:t>
       </w:r>
     </w:p>
     <w:p>
@@ -5966,7 +6829,19 @@
         <w:rPr>
           <w:color w:val="0D1B2A"/>
         </w:rPr>
-        <w:t>Effective WPM: speed × comprehension — the gold-standard composite measure</w:t>
+        <w:t xml:space="preserve">Effective WPM: speed × comprehension </w:t>
+      </w:r>
+      <w:r>
+        <w:rPr>
+          <w:color w:val="0D1B2A"/>
+        </w:rPr>
+        <w:t>-</w:t>
+      </w:r>
+      <w:r>
+        <w:rPr>
+          <w:color w:val="0D1B2A"/>
+        </w:rPr>
+        <w:t xml:space="preserve"> the gold-standard composite measure</w:t>
       </w:r>
     </w:p>
     <w:p/>
@@ -6023,7 +6898,13 @@
         <w:rPr>
           <w:color w:val="0D1B2A"/>
         </w:rPr>
-        <w:t>Zen mode: distraction-free reading with faded controls, activated by keystroke</w:t>
+        <w:t xml:space="preserve">Zen mode: distraction-free reading with faded controls, activated by </w:t>
+      </w:r>
+      <w:r>
+        <w:rPr>
+          <w:color w:val="0D1B2A"/>
+        </w:rPr>
+        <w:t>keystroke.</w:t>
       </w:r>
     </w:p>
     <w:p>
@@ -6039,7 +6920,13 @@
         <w:rPr>
           <w:color w:val="0D1B2A"/>
         </w:rPr>
-        <w:t>Focus Timer in header: full Pomodoro with rounds, long breaks, auto-start, progress ring</w:t>
+        <w:t xml:space="preserve">Focus Timer in header: full Pomodoro with rounds, long breaks, auto-start, progress </w:t>
+      </w:r>
+      <w:r>
+        <w:rPr>
+          <w:color w:val="0D1B2A"/>
+        </w:rPr>
+        <w:t>ring.</w:t>
       </w:r>
     </w:p>
     <w:p>
@@ -6055,7 +6942,25 @@
         <w:rPr>
           <w:color w:val="0D1B2A"/>
         </w:rPr>
-        <w:t>Session persistence: loaded text, position, and timer state survive page refresh — zero data loss</w:t>
+        <w:t xml:space="preserve">Session persistence: loaded text, position, and timer state survive page refresh </w:t>
+      </w:r>
+      <w:r>
+        <w:rPr>
+          <w:color w:val="0D1B2A"/>
+        </w:rPr>
+        <w:t>-</w:t>
+      </w:r>
+      <w:r>
+        <w:rPr>
+          <w:color w:val="0D1B2A"/>
+        </w:rPr>
+        <w:t xml:space="preserve"> zero data </w:t>
+      </w:r>
+      <w:r>
+        <w:rPr>
+          <w:color w:val="0D1B2A"/>
+        </w:rPr>
+        <w:t>loss.</w:t>
       </w:r>
     </w:p>
     <w:p>
@@ -6074,7 +6979,16 @@
         <w:t>Structured onboarding</w:t>
       </w:r>
       <w:r>
-        <w:t xml:space="preserve"> — first-run 14-day training ramp (200 → 250 → 300+ WPM) with progress bar, calibration session, and daily training day counter grounded in RSVP adaptation research</w:t>
+        <w:t xml:space="preserve"> </w:t>
+      </w:r>
+      <w:r>
+        <w:t>-</w:t>
+      </w:r>
+      <w:r>
+        <w:t xml:space="preserve"> first-run 14-day training ramp (200 → 250 → 300+ WPM) with progress bar, calibration session, and daily training day counter grounded in RSVP adaptation </w:t>
+      </w:r>
+      <w:r>
+        <w:t>research.</w:t>
       </w:r>
     </w:p>
     <w:p>
@@ -6093,7 +7007,16 @@
         <w:t>Guided feature tour</w:t>
       </w:r>
       <w:r>
-        <w:t xml:space="preserve"> — 6-step spotlight walkthrough on first launch highlights every key surface with a glowing focus ring and contextual popover; state persisted locally</w:t>
+        <w:t xml:space="preserve"> </w:t>
+      </w:r>
+      <w:r>
+        <w:t>-</w:t>
+      </w:r>
+      <w:r>
+        <w:t xml:space="preserve"> 6-step spotlight walkthrough on first launch highlights every key surface with a glowing focus ring and contextual popover; state persisted </w:t>
+      </w:r>
+      <w:r>
+        <w:t>locally.</w:t>
       </w:r>
     </w:p>
     <w:p>
@@ -6112,7 +7035,16 @@
         <w:t>Contextual tooltips</w:t>
       </w:r>
       <w:r>
-        <w:t xml:space="preserve"> — every setting carries an inline explanation covering what it does, the science behind it, and when to use it; zero documentation required</w:t>
+        <w:t xml:space="preserve"> </w:t>
+      </w:r>
+      <w:r>
+        <w:t>-</w:t>
+      </w:r>
+      <w:r>
+        <w:t xml:space="preserve"> every setting carries an inline explanation covering what it does, the science behind it, and when to use it; zero documentation </w:t>
+      </w:r>
+      <w:r>
+        <w:t>required.</w:t>
       </w:r>
     </w:p>
     <w:p>
@@ -6484,7 +7416,13 @@
         <w:rPr>
           <w:color w:val="0D1B2A"/>
         </w:rPr>
-        <w:t>Students with IEPs and 504 plans requiring reading accommodations</w:t>
+        <w:t xml:space="preserve">Students with IEPs and 504 plans requiring reading </w:t>
+      </w:r>
+      <w:r>
+        <w:rPr>
+          <w:color w:val="0D1B2A"/>
+        </w:rPr>
+        <w:t>accommodation.</w:t>
       </w:r>
     </w:p>
     <w:p>
@@ -6516,7 +7454,25 @@
         <w:rPr>
           <w:color w:val="0D1B2A"/>
         </w:rPr>
-        <w:t>Non-native language readers managing cognitive load in a second language</w:t>
+        <w:t xml:space="preserve">Non-native language readers </w:t>
+      </w:r>
+      <w:r>
+        <w:rPr>
+          <w:color w:val="0D1B2A"/>
+        </w:rPr>
+        <w:t>manage</w:t>
+      </w:r>
+      <w:r>
+        <w:rPr>
+          <w:color w:val="0D1B2A"/>
+        </w:rPr>
+        <w:t xml:space="preserve"> cognitive load in a second </w:t>
+      </w:r>
+      <w:r>
+        <w:rPr>
+          <w:color w:val="0D1B2A"/>
+        </w:rPr>
+        <w:t>language.</w:t>
       </w:r>
     </w:p>
     <w:p>
@@ -6532,7 +7488,13 @@
         <w:rPr>
           <w:color w:val="0D1B2A"/>
         </w:rPr>
-        <w:t>Professionals managing high-volume reading: legal, medical, research, finance</w:t>
+        <w:t xml:space="preserve">Professionals managing high-volume reading: legal, medical, research, </w:t>
+      </w:r>
+      <w:r>
+        <w:rPr>
+          <w:color w:val="0D1B2A"/>
+        </w:rPr>
+        <w:t>finance.</w:t>
       </w:r>
     </w:p>
     <w:p>
@@ -6548,7 +7510,13 @@
         <w:rPr>
           <w:color w:val="0D1B2A"/>
         </w:rPr>
-        <w:t>Commuters and mobile users consuming long-form content</w:t>
+        <w:t xml:space="preserve">Commuters and mobile users consuming long-form </w:t>
+      </w:r>
+      <w:r>
+        <w:rPr>
+          <w:color w:val="0D1B2A"/>
+        </w:rPr>
+        <w:t>content.</w:t>
       </w:r>
     </w:p>
     <w:p/>
@@ -6568,7 +7536,31 @@
         <w:rPr>
           <w:color w:val="0D1B2A"/>
         </w:rPr>
-        <w:t>Because Focal is free and single-file, it distributes through any channel: school districts, hospital patient portals, corporate HR platforms, public library systems, government accessibility programmes. There is no friction. No download. No account. You share a link and it works.</w:t>
+        <w:t xml:space="preserve">Because Focal is free and </w:t>
+      </w:r>
+      <w:r>
+        <w:rPr>
+          <w:color w:val="0D1B2A"/>
+        </w:rPr>
+        <w:t>single file</w:t>
+      </w:r>
+      <w:r>
+        <w:rPr>
+          <w:color w:val="0D1B2A"/>
+        </w:rPr>
+        <w:t xml:space="preserve">, it distributes through any channel: school districts, hospital patient portals, corporate HR platforms, public library systems, government accessibility </w:t>
+      </w:r>
+      <w:r>
+        <w:rPr>
+          <w:color w:val="0D1B2A"/>
+        </w:rPr>
+        <w:t>programs</w:t>
+      </w:r>
+      <w:r>
+        <w:rPr>
+          <w:color w:val="0D1B2A"/>
+        </w:rPr>
+        <w:t>. There is no friction. No download. No account. You share a link and it works.</w:t>
       </w:r>
     </w:p>
     <w:p/>
@@ -6606,7 +7598,19 @@
         <w:rPr>
           <w:color w:val="0D1B2A"/>
         </w:rPr>
-        <w:t>The core Focal application is and will remain free. This is not a limitation — it is the distribution strategy. The widest possible reach is the asset.</w:t>
+        <w:t xml:space="preserve">The core Focal application is and will remain free. This is not a limitation </w:t>
+      </w:r>
+      <w:r>
+        <w:rPr>
+          <w:color w:val="0D1B2A"/>
+        </w:rPr>
+        <w:t>-</w:t>
+      </w:r>
+      <w:r>
+        <w:rPr>
+          <w:color w:val="0D1B2A"/>
+        </w:rPr>
+        <w:t xml:space="preserve"> it is the distribution strategy. The widest possible reach is the asset.</w:t>
       </w:r>
     </w:p>
     <w:p/>
@@ -6634,7 +7638,13 @@
         <w:t xml:space="preserve">Focal Pro: </w:t>
       </w:r>
       <w:r>
-        <w:t>Premium tier — advanced AI features, team libraries, cross-device sync</w:t>
+        <w:t xml:space="preserve">Premium tier </w:t>
+      </w:r>
+      <w:r>
+        <w:t>-</w:t>
+      </w:r>
+      <w:r>
+        <w:t xml:space="preserve"> advanced AI features, team libraries, cross-device sync</w:t>
       </w:r>
     </w:p>
     <w:p>
@@ -6653,7 +7663,10 @@
         <w:t xml:space="preserve">Focal for Education: </w:t>
       </w:r>
       <w:r>
-        <w:t>School district licensing with teacher dashboards, reading progress tracking, and IEP integration</w:t>
+        <w:t xml:space="preserve">School district licensing with teacher dashboards, reading progress tracking, and IEP </w:t>
+      </w:r>
+      <w:r>
+        <w:t>integration.</w:t>
       </w:r>
     </w:p>
     <w:p>
@@ -6792,7 +7805,19 @@
               <w:rPr>
                 <w:color w:val="0D1B2A"/>
               </w:rPr>
-              <w:t>Free at the base. Institutional and enterprise revenue above. The people who need it most pay nothing. The organisations that serve them do.</w:t>
+              <w:t xml:space="preserve">Free at the base. Institutional and enterprise revenue above. The people who need it most pay nothing. The </w:t>
+            </w:r>
+            <w:r>
+              <w:rPr>
+                <w:color w:val="0D1B2A"/>
+              </w:rPr>
+              <w:t>organizations</w:t>
+            </w:r>
+            <w:r>
+              <w:rPr>
+                <w:color w:val="0D1B2A"/>
+              </w:rPr>
+              <w:t xml:space="preserve"> that serve them do.</w:t>
             </w:r>
           </w:p>
         </w:tc>
@@ -6833,7 +7858,31 @@
         <w:rPr>
           <w:color w:val="0D1B2A"/>
         </w:rPr>
-        <w:t>Reading is not just a skill. It is the mechanism by which human beings access knowledge, opportunity, and participation in society. When 20% of the population is locked out of that mechanism — not by choice, not by laziness, but by the arbitrary way we have decided to display text — the loss is immeasurable.</w:t>
+        <w:t xml:space="preserve">Reading is not just a skill. It is the mechanism by which human beings access knowledge, opportunity, and participation in society. When 20% of the population is locked out of that mechanism </w:t>
+      </w:r>
+      <w:r>
+        <w:rPr>
+          <w:color w:val="0D1B2A"/>
+        </w:rPr>
+        <w:t>-</w:t>
+      </w:r>
+      <w:r>
+        <w:rPr>
+          <w:color w:val="0D1B2A"/>
+        </w:rPr>
+        <w:t xml:space="preserve"> not by choice, not by laziness, but by the arbitrary way we have decided to display text </w:t>
+      </w:r>
+      <w:r>
+        <w:rPr>
+          <w:color w:val="0D1B2A"/>
+        </w:rPr>
+        <w:t>-</w:t>
+      </w:r>
+      <w:r>
+        <w:rPr>
+          <w:color w:val="0D1B2A"/>
+        </w:rPr>
+        <w:t xml:space="preserve"> the loss is immeasurable.</w:t>
       </w:r>
     </w:p>
     <w:p>
@@ -6873,7 +7922,37 @@
           <w:sz w:val="36"/>
           <w:szCs w:val="36"/>
         </w:rPr>
-        <w:t>Focal  —  Reading Without Barriers</w:t>
+        <w:t xml:space="preserve">Focal </w:t>
+      </w:r>
+      <w:r>
+        <w:rPr>
+          <w:b/>
+          <w:bCs/>
+          <w:color w:val="1E3A5F"/>
+          <w:sz w:val="36"/>
+          <w:szCs w:val="36"/>
+        </w:rPr>
+        <w:t>-</w:t>
+      </w:r>
+      <w:r>
+        <w:rPr>
+          <w:b/>
+          <w:bCs/>
+          <w:color w:val="1E3A5F"/>
+          <w:sz w:val="36"/>
+          <w:szCs w:val="36"/>
+        </w:rPr>
+        <w:t xml:space="preserve"> Reading</w:t>
+      </w:r>
+      <w:r>
+        <w:rPr>
+          <w:b/>
+          <w:bCs/>
+          <w:color w:val="1E3A5F"/>
+          <w:sz w:val="36"/>
+          <w:szCs w:val="36"/>
+        </w:rPr>
+        <w:t xml:space="preserve"> Without Barriers</w:t>
       </w:r>
     </w:p>
     <w:p/>
@@ -6951,7 +8030,19 @@
         <w:rPr>
           <w:color w:val="0D1B2A"/>
         </w:rPr>
-        <w:t>Distribution: School district and enterprise sales; accessibility organisation partnerships</w:t>
+        <w:t xml:space="preserve">Distribution: School district and enterprise sales; accessibility </w:t>
+      </w:r>
+      <w:r>
+        <w:rPr>
+          <w:color w:val="0D1B2A"/>
+        </w:rPr>
+        <w:t>organization</w:t>
+      </w:r>
+      <w:r>
+        <w:rPr>
+          <w:color w:val="0D1B2A"/>
+        </w:rPr>
+        <w:t xml:space="preserve"> partnerships</w:t>
       </w:r>
     </w:p>
     <w:p>
@@ -7049,7 +8140,13 @@
               <w:rPr>
                 <w:color w:val="0D1B2A"/>
               </w:rPr>
-              <w:t xml:space="preserve">info@diatasso.net  •  </w:t>
+              <w:t>info@diatasso.net •</w:t>
+            </w:r>
+            <w:r>
+              <w:rPr>
+                <w:color w:val="0D1B2A"/>
+              </w:rPr>
+              <w:t xml:space="preserve">  </w:t>
             </w:r>
             <w:r>
               <w:rPr>
@@ -7174,7 +8271,31 @@
         <w:sz w:val="17"/>
         <w:szCs w:val="17"/>
       </w:rPr>
-      <w:t xml:space="preserve">  •  focal.app  •  © 202</w:t>
+      <w:t xml:space="preserve">  •  </w:t>
+    </w:r>
+    <w:r>
+      <w:rPr>
+        <w:color w:val="4A5568"/>
+        <w:sz w:val="17"/>
+        <w:szCs w:val="17"/>
+      </w:rPr>
+      <w:t xml:space="preserve">focal.app </w:t>
+    </w:r>
+    <w:r>
+      <w:rPr>
+        <w:color w:val="4A5568"/>
+        <w:sz w:val="17"/>
+        <w:szCs w:val="17"/>
+      </w:rPr>
+      <w:t>• ©</w:t>
+    </w:r>
+    <w:r>
+      <w:rPr>
+        <w:color w:val="4A5568"/>
+        <w:sz w:val="17"/>
+        <w:szCs w:val="17"/>
+      </w:rPr>
+      <w:t xml:space="preserve"> 202</w:t>
     </w:r>
     <w:r>
       <w:rPr>
@@ -7230,7 +8351,39 @@
         <w:sz w:val="17"/>
         <w:szCs w:val="17"/>
       </w:rPr>
-      <w:t>Focal  •  Investor Brief  •  Confidential</w:t>
+      <w:t xml:space="preserve">Focal </w:t>
+    </w:r>
+    <w:r>
+      <w:rPr>
+        <w:color w:val="4A5568"/>
+        <w:sz w:val="17"/>
+        <w:szCs w:val="17"/>
+      </w:rPr>
+      <w:t>• Investor</w:t>
+    </w:r>
+    <w:r>
+      <w:rPr>
+        <w:color w:val="4A5568"/>
+        <w:sz w:val="17"/>
+        <w:szCs w:val="17"/>
+      </w:rPr>
+      <w:t xml:space="preserve"> </w:t>
+    </w:r>
+    <w:r>
+      <w:rPr>
+        <w:color w:val="4A5568"/>
+        <w:sz w:val="17"/>
+        <w:szCs w:val="17"/>
+      </w:rPr>
+      <w:t xml:space="preserve">Brief </w:t>
+    </w:r>
+    <w:r>
+      <w:rPr>
+        <w:color w:val="4A5568"/>
+        <w:sz w:val="17"/>
+        <w:szCs w:val="17"/>
+      </w:rPr>
+      <w:t>• Confidential</w:t>
     </w:r>
   </w:p>
 </w:hdr>
@@ -7936,6 +9089,7 @@
   <w:style w:type="character" w:default="1" w:styleId="DefaultParagraphFont">
     <w:name w:val="Default Paragraph Font"/>
     <w:uiPriority w:val="1"/>
+    <w:semiHidden/>
     <w:unhideWhenUsed/>
   </w:style>
   <w:style w:type="table" w:default="1" w:styleId="TableNormal">

</xml_diff>